<commit_message>
Record Stage 4-5 evidence and add DAA result tables
Stage 4 maps historical flood inventories with a distance sweep and
labels BLOCKED/SEVERE as scenario overlays. Stage 5 imports the Stage 3
graph into SUMO with SYNTHETIC demand. The DAA Word file now includes
those tables plus the earlier synthetic CLMS comparison.

Co-authored-by: rohit michael <rohitmichael-alt@users.noreply.github.com>
</commit_message>
<xml_diff>
--- a/docs/DAA_ASSIGNMENT.docx
+++ b/docs/DAA_ASSIGNMENT.docx
@@ -60,32 +60,6 @@
         <w:t xml:space="preserve">Assignment</w:t>
       </w:r>
     </w:p>
-    <w:sdt>
-      <w:sdtPr>
-        <w:docPartObj>
-          <w:docPartGallery w:val="Table of Contents"/>
-          <w:docPartUnique/>
-        </w:docPartObj>
-      </w:sdtPr>
-      <w:sdtContent>
-        <w:p>
-          <w:pPr>
-            <w:pStyle w:val="TOCHeading"/>
-          </w:pPr>
-          <w:r>
-            <w:t xml:space="preserve">Table of Contents</w:t>
-          </w:r>
-        </w:p>
-        <w:p>
-          <w:r>
-            <w:fldChar w:fldCharType="begin" w:dirty="true"/>
-            <w:instrText xml:space="preserve">TOC \o "1-2" \h \z \u</w:instrText>
-            <w:fldChar w:fldCharType="separate"/>
-            <w:fldChar w:fldCharType="end"/>
-          </w:r>
-        </w:p>
-      </w:sdtContent>
-    </w:sdt>
     <w:p>
       <w:pPr>
         <w:pStyle w:val="FirstParagraph"/>
@@ -185,7 +159,7 @@
         <w:pStyle w:val="BodyText"/>
       </w:pPr>
       <w:r>
-        <w:t xml:space="preserve">This document is the DAA assignment submission. It is separate from the longer project research-and-evidence file. Experimental comparison tables for implementation and existing algorithms will be added after Stages 4 and 5.</w:t>
+        <w:t xml:space="preserve">This document is the DAA assignment submission. It is separate from the longer project research-and-evidence file. Experimental tables below use Stage 3–5 artifacts plus the earlier synthetic certificate experiment. They do not claim calibrated Chennai traffic or city-scale CCH timings.</w:t>
       </w:r>
     </w:p>
     <w:p>
@@ -9503,7 +9477,7 @@
     </w:p>
     <w:bookmarkEnd w:id="55"/>
     <w:bookmarkEnd w:id="56"/>
-    <w:bookmarkStart w:id="57" w:name="implementation"/>
+    <w:bookmarkStart w:id="60" w:name="implementation"/>
     <w:p>
       <w:pPr>
         <w:pStyle w:val="Heading1"/>
@@ -9544,15 +9518,1507 @@
         <w:pStyle w:val="BodyText"/>
       </w:pPr>
       <w:r>
-        <w:t xml:space="preserve">Reproduction commands, city-scale run logs, and execution-result tables will be inserted here after Stages 4 and 5, when flood/road-state evidence and SUMO scenarios exist. Until then, this section does not present experimental numbers.</w:t>
+        <w:t xml:space="preserve">Reproduction:</w:t>
       </w:r>
     </w:p>
     <w:p>
       <w:pPr>
+        <w:pStyle w:val="SourceCode"/>
+      </w:pPr>
+      <w:r>
+        <w:rPr>
+          <w:rStyle w:val="ExtensionTok"/>
+        </w:rPr>
+        <w:t xml:space="preserve">python</w:t>
+      </w:r>
+      <w:r>
+        <w:rPr>
+          <w:rStyle w:val="NormalTok"/>
+        </w:rPr>
+        <w:t xml:space="preserve"> scripts/run_stage3_graph.py</w:t>
+      </w:r>
+      <w:r>
+        <w:br/>
+      </w:r>
+      <w:r>
+        <w:rPr>
+          <w:rStyle w:val="ExtensionTok"/>
+        </w:rPr>
+        <w:t xml:space="preserve">python</w:t>
+      </w:r>
+      <w:r>
+        <w:rPr>
+          <w:rStyle w:val="NormalTok"/>
+        </w:rPr>
+        <w:t xml:space="preserve"> scripts/run_stage4_road_state.py</w:t>
+      </w:r>
+      <w:r>
+        <w:br/>
+      </w:r>
+      <w:r>
+        <w:rPr>
+          <w:rStyle w:val="ExtensionTok"/>
+        </w:rPr>
+        <w:t xml:space="preserve">python</w:t>
+      </w:r>
+      <w:r>
+        <w:rPr>
+          <w:rStyle w:val="NormalTok"/>
+        </w:rPr>
+        <w:t xml:space="preserve"> scripts/run_stage5_sumo.py</w:t>
+      </w:r>
+      <w:r>
+        <w:br/>
+      </w:r>
+      <w:r>
+        <w:rPr>
+          <w:rStyle w:val="ExtensionTok"/>
+        </w:rPr>
+        <w:t xml:space="preserve">python</w:t>
+      </w:r>
+      <w:r>
+        <w:rPr>
+          <w:rStyle w:val="NormalTok"/>
+        </w:rPr>
+        <w:t xml:space="preserve"> scripts/run_certified_lazy_experiment.py </w:t>
+      </w:r>
+      <w:r>
+        <w:rPr>
+          <w:rStyle w:val="AttributeTok"/>
+        </w:rPr>
+        <w:t xml:space="preserve">--engine</w:t>
+      </w:r>
+      <w:r>
+        <w:rPr>
+          <w:rStyle w:val="NormalTok"/>
+        </w:rPr>
+        <w:t xml:space="preserve"> both </w:t>
+      </w:r>
+      <w:r>
+        <w:rPr>
+          <w:rStyle w:val="AttributeTok"/>
+        </w:rPr>
+        <w:t xml:space="preserve">--mode</w:t>
+      </w:r>
+      <w:r>
+        <w:rPr>
+          <w:rStyle w:val="NormalTok"/>
+        </w:rPr>
+        <w:t xml:space="preserve"> both</w:t>
+      </w:r>
+    </w:p>
+    <w:bookmarkStart w:id="57" w:name="dated-greater-chennai-graph-stage-3"/>
+    <w:p>
+      <w:pPr>
+        <w:pStyle w:val="Heading2"/>
+      </w:pPr>
+      <w:r>
+        <w:t xml:space="preserve">9.1 Dated Greater Chennai graph (Stage 3)</w:t>
+      </w:r>
+    </w:p>
+    <w:p>
+      <w:pPr>
+        <w:pStyle w:val="FirstParagraph"/>
+      </w:pPr>
+      <w:r>
+        <w:t xml:space="preserve">Source: Geofabrik</w:t>
+      </w:r>
+      <w:r>
+        <w:t xml:space="preserve"> </w:t>
+      </w:r>
+      <w:r>
+        <w:rPr>
+          <w:rStyle w:val="VerbatimChar"/>
+        </w:rPr>
+        <w:t xml:space="preserve">india-260901.osm.pbf</w:t>
+      </w:r>
+      <w:r>
+        <w:t xml:space="preserve">, provider MD5</w:t>
+      </w:r>
+      <w:r>
+        <w:t xml:space="preserve"> </w:t>
+      </w:r>
+      <w:r>
+        <w:rPr>
+          <w:rStyle w:val="VerbatimChar"/>
+        </w:rPr>
+        <w:t xml:space="preserve">44ec6a7dff8ff2f3382da80a546b505f</w:t>
+      </w:r>
+      <w:r>
+        <w:t xml:space="preserve">, clipped to the GCC 2022 ward union. Decision:</w:t>
+      </w:r>
+      <w:r>
+        <w:t xml:space="preserve"> </w:t>
+      </w:r>
+      <w:r>
+        <w:rPr>
+          <w:bCs/>
+          <w:b/>
+        </w:rPr>
+        <w:t xml:space="preserve">PASS WITH REPORTED ATTRIBUTE MISSINGNESS</w:t>
+      </w:r>
+      <w:r>
+        <w:t xml:space="preserve">.</w:t>
+      </w:r>
+    </w:p>
+    <w:tbl>
+      <w:tblPr>
+        <w:tblStyle w:val="Table"/>
+        <w:tblW w:type="auto" w:w="0"/>
+        <w:tblLook w:firstRow="1" w:lastRow="0" w:firstColumn="0" w:lastColumn="0" w:noHBand="0" w:noVBand="0" w:val="0020"/>
+        <w:jc w:val="start"/>
+      </w:tblPr>
+      <w:tblGrid>
+        <w:gridCol w:w="2640"/>
+        <w:gridCol w:w="2640"/>
+        <w:gridCol w:w="2640"/>
+      </w:tblGrid>
+      <w:tr>
+        <w:trPr>
+          <w:tblHeader w:val="true"/>
+        </w:trPr>
+        <w:tc>
+          <w:tcPr/>
+          <w:p>
+            <w:pPr>
+              <w:pStyle w:val="Compact"/>
+              <w:jc w:val="left"/>
+            </w:pPr>
+            <w:r>
+              <w:t xml:space="preserve">Quantity</w:t>
+            </w:r>
+          </w:p>
+        </w:tc>
+        <w:tc>
+          <w:tcPr/>
+          <w:p>
+            <w:pPr>
+              <w:pStyle w:val="Compact"/>
+              <w:jc w:val="right"/>
+            </w:pPr>
+            <w:r>
+              <w:t xml:space="preserve">Value</w:t>
+            </w:r>
+          </w:p>
+        </w:tc>
+        <w:tc>
+          <w:tcPr/>
+          <w:p>
+            <w:pPr>
+              <w:pStyle w:val="Compact"/>
+              <w:jc w:val="left"/>
+            </w:pPr>
+            <w:r>
+              <w:t xml:space="preserve">Classification</w:t>
+            </w:r>
+          </w:p>
+        </w:tc>
+      </w:tr>
+      <w:tr>
+        <w:tc>
+          <w:tcPr/>
+          <w:p>
+            <w:pPr>
+              <w:pStyle w:val="Compact"/>
+              <w:jc w:val="left"/>
+            </w:pPr>
+            <w:r>
+              <w:t xml:space="preserve">Nodes</w:t>
+            </w:r>
+          </w:p>
+        </w:tc>
+        <w:tc>
+          <w:tcPr/>
+          <w:p>
+            <w:pPr>
+              <w:pStyle w:val="Compact"/>
+              <w:jc w:val="right"/>
+            </w:pPr>
+            <w:r>
+              <w:t xml:space="preserve">155,345</w:t>
+            </w:r>
+          </w:p>
+        </w:tc>
+        <w:tc>
+          <w:tcPr/>
+          <w:p>
+            <w:pPr>
+              <w:pStyle w:val="Compact"/>
+              <w:jc w:val="left"/>
+            </w:pPr>
+            <w:r>
+              <w:t xml:space="preserve">OBSERVED</w:t>
+            </w:r>
+          </w:p>
+        </w:tc>
+      </w:tr>
+      <w:tr>
+        <w:tc>
+          <w:tcPr/>
+          <w:p>
+            <w:pPr>
+              <w:pStyle w:val="Compact"/>
+              <w:jc w:val="left"/>
+            </w:pPr>
+            <w:r>
+              <w:t xml:space="preserve">Directed arcs</w:t>
+            </w:r>
+          </w:p>
+        </w:tc>
+        <w:tc>
+          <w:tcPr/>
+          <w:p>
+            <w:pPr>
+              <w:pStyle w:val="Compact"/>
+              <w:jc w:val="right"/>
+            </w:pPr>
+            <w:r>
+              <w:t xml:space="preserve">331,545</w:t>
+            </w:r>
+          </w:p>
+        </w:tc>
+        <w:tc>
+          <w:tcPr/>
+          <w:p>
+            <w:pPr>
+              <w:pStyle w:val="Compact"/>
+              <w:jc w:val="left"/>
+            </w:pPr>
+            <w:r>
+              <w:t xml:space="preserve">OBSERVED</w:t>
+            </w:r>
+          </w:p>
+        </w:tc>
+      </w:tr>
+      <w:tr>
+        <w:tc>
+          <w:tcPr/>
+          <w:p>
+            <w:pPr>
+              <w:pStyle w:val="Compact"/>
+              <w:jc w:val="left"/>
+            </w:pPr>
+            <w:r>
+              <w:t xml:space="preserve">Weak / strong components</w:t>
+            </w:r>
+          </w:p>
+        </w:tc>
+        <w:tc>
+          <w:tcPr/>
+          <w:p>
+            <w:pPr>
+              <w:pStyle w:val="Compact"/>
+              <w:jc w:val="right"/>
+            </w:pPr>
+            <w:r>
+              <w:t xml:space="preserve">1 / 1</w:t>
+            </w:r>
+          </w:p>
+        </w:tc>
+        <w:tc>
+          <w:tcPr/>
+          <w:p>
+            <w:pPr>
+              <w:pStyle w:val="Compact"/>
+              <w:jc w:val="left"/>
+            </w:pPr>
+            <w:r>
+              <w:t xml:space="preserve">OBSERVED</w:t>
+            </w:r>
+          </w:p>
+        </w:tc>
+      </w:tr>
+      <w:tr>
+        <w:tc>
+          <w:tcPr/>
+          <w:p>
+            <w:pPr>
+              <w:pStyle w:val="Compact"/>
+              <w:jc w:val="left"/>
+            </w:pPr>
+            <w:r>
+              <w:t xml:space="preserve">Explicit OSM maxspeed arcs</w:t>
+            </w:r>
+          </w:p>
+        </w:tc>
+        <w:tc>
+          <w:tcPr/>
+          <w:p>
+            <w:pPr>
+              <w:pStyle w:val="Compact"/>
+              <w:jc w:val="right"/>
+            </w:pPr>
+            <w:r>
+              <w:t xml:space="preserve">6,092</w:t>
+            </w:r>
+          </w:p>
+        </w:tc>
+        <w:tc>
+          <w:tcPr/>
+          <w:p>
+            <w:pPr>
+              <w:pStyle w:val="Compact"/>
+              <w:jc w:val="left"/>
+            </w:pPr>
+            <w:r>
+              <w:t xml:space="preserve">OBSERVED</w:t>
+            </w:r>
+          </w:p>
+        </w:tc>
+      </w:tr>
+      <w:tr>
+        <w:tc>
+          <w:tcPr/>
+          <w:p>
+            <w:pPr>
+              <w:pStyle w:val="Compact"/>
+              <w:jc w:val="left"/>
+            </w:pPr>
+            <w:r>
+              <w:t xml:space="preserve">Missing maxspeed arcs</w:t>
+            </w:r>
+          </w:p>
+        </w:tc>
+        <w:tc>
+          <w:tcPr/>
+          <w:p>
+            <w:pPr>
+              <w:pStyle w:val="Compact"/>
+              <w:jc w:val="right"/>
+            </w:pPr>
+            <w:r>
+              <w:t xml:space="preserve">325,453</w:t>
+            </w:r>
+          </w:p>
+        </w:tc>
+        <w:tc>
+          <w:tcPr/>
+          <w:p>
+            <w:pPr>
+              <w:pStyle w:val="Compact"/>
+              <w:jc w:val="left"/>
+            </w:pPr>
+            <w:r>
+              <w:t xml:space="preserve">UNAVAILABLE</w:t>
+            </w:r>
+          </w:p>
+        </w:tc>
+      </w:tr>
+      <w:tr>
+        <w:tc>
+          <w:tcPr/>
+          <w:p>
+            <w:pPr>
+              <w:pStyle w:val="Compact"/>
+              <w:jc w:val="left"/>
+            </w:pPr>
+            <w:r>
+              <w:t xml:space="preserve">Missing lanes</w:t>
+            </w:r>
+          </w:p>
+        </w:tc>
+        <w:tc>
+          <w:tcPr/>
+          <w:p>
+            <w:pPr>
+              <w:pStyle w:val="Compact"/>
+              <w:jc w:val="right"/>
+            </w:pPr>
+            <w:r>
+              <w:t xml:space="preserve">318,131</w:t>
+            </w:r>
+          </w:p>
+        </w:tc>
+        <w:tc>
+          <w:tcPr/>
+          <w:p>
+            <w:pPr>
+              <w:pStyle w:val="Compact"/>
+              <w:jc w:val="left"/>
+            </w:pPr>
+            <w:r>
+              <w:t xml:space="preserve">UNAVAILABLE</w:t>
+            </w:r>
+          </w:p>
+        </w:tc>
+      </w:tr>
+      <w:tr>
+        <w:tc>
+          <w:tcPr/>
+          <w:p>
+            <w:pPr>
+              <w:pStyle w:val="Compact"/>
+              <w:jc w:val="left"/>
+            </w:pPr>
+            <w:r>
+              <w:t xml:space="preserve">Free-flow time assigned</w:t>
+            </w:r>
+          </w:p>
+        </w:tc>
+        <w:tc>
+          <w:tcPr/>
+          <w:p>
+            <w:pPr>
+              <w:pStyle w:val="Compact"/>
+              <w:jc w:val="right"/>
+            </w:pPr>
+            <w:r>
+              <w:t xml:space="preserve">6,092</w:t>
+            </w:r>
+          </w:p>
+        </w:tc>
+        <w:tc>
+          <w:tcPr/>
+          <w:p>
+            <w:pPr>
+              <w:pStyle w:val="Compact"/>
+              <w:jc w:val="left"/>
+            </w:pPr>
+            <w:r>
+              <w:t xml:space="preserve">OBSERVED only where speed exists</w:t>
+            </w:r>
+          </w:p>
+        </w:tc>
+      </w:tr>
+      <w:tr>
+        <w:tc>
+          <w:tcPr/>
+          <w:p>
+            <w:pPr>
+              <w:pStyle w:val="Compact"/>
+              <w:jc w:val="left"/>
+            </w:pPr>
+            <w:r>
+              <w:t xml:space="preserve">Arc-ID collisions</w:t>
+            </w:r>
+          </w:p>
+        </w:tc>
+        <w:tc>
+          <w:tcPr/>
+          <w:p>
+            <w:pPr>
+              <w:pStyle w:val="Compact"/>
+              <w:jc w:val="right"/>
+            </w:pPr>
+            <w:r>
+              <w:t xml:space="preserve">0</w:t>
+            </w:r>
+          </w:p>
+        </w:tc>
+        <w:tc>
+          <w:tcPr/>
+          <w:p>
+            <w:pPr>
+              <w:pStyle w:val="Compact"/>
+              <w:jc w:val="left"/>
+            </w:pPr>
+            <w:r>
+              <w:t xml:space="preserve">OBSERVED</w:t>
+            </w:r>
+          </w:p>
+        </w:tc>
+      </w:tr>
+    </w:tbl>
+    <w:p>
+      <w:pPr>
         <w:pStyle w:val="BodyText"/>
       </w:pPr>
       <w:r>
-        <w:t xml:space="preserve">Still required before those tables: a dated Greater Chennai OSM graph, explained road states, SUMO demand, and a city-scale CCH validation that includes turns and closures.</w:t>
+        <w:t xml:space="preserve">This graph is not a calibrated traffic network. Missing speeds were not replaced by a silent city-wide default in Stage 3.</w:t>
+      </w:r>
+    </w:p>
+    <w:bookmarkEnd w:id="57"/>
+    <w:bookmarkStart w:id="58" w:name="explained-road-states-stage-4"/>
+    <w:p>
+      <w:pPr>
+        <w:pStyle w:val="Heading2"/>
+      </w:pPr>
+      <w:r>
+        <w:t xml:space="preserve">9.2 Explained road states (Stage 4)</w:t>
+      </w:r>
+    </w:p>
+    <w:p>
+      <w:pPr>
+        <w:pStyle w:val="FirstParagraph"/>
+      </w:pPr>
+      <w:r>
+        <w:t xml:space="preserve">Historical OpenCity inventories were mapped with a distance sweep. 150 m is a</w:t>
+      </w:r>
+      <w:r>
+        <w:t xml:space="preserve"> </w:t>
+      </w:r>
+      <w:r>
+        <w:rPr>
+          <w:bCs/>
+          <w:b/>
+        </w:rPr>
+        <w:t xml:space="preserve">SCENARIO</w:t>
+      </w:r>
+      <w:r>
+        <w:t xml:space="preserve"> </w:t>
+      </w:r>
+      <w:r>
+        <w:t xml:space="preserve">reporting distance (same as the Stage 1 demo), not measured KML accuracy. Rainfall and DEM do not create closures. BLOCKED/SEVERE labels are declared scenario rules.</w:t>
+      </w:r>
+    </w:p>
+    <w:tbl>
+      <w:tblPr>
+        <w:tblStyle w:val="Table"/>
+        <w:tblW w:type="pct" w:w="5000"/>
+        <w:tblLook w:firstRow="1" w:lastRow="0" w:firstColumn="0" w:lastColumn="0" w:noHBand="0" w:noVBand="0" w:val="0020"/>
+        <w:jc w:val="start"/>
+      </w:tblPr>
+      <w:tblGrid>
+        <w:gridCol w:w="1584"/>
+        <w:gridCol w:w="1584"/>
+        <w:gridCol w:w="1584"/>
+        <w:gridCol w:w="1584"/>
+        <w:gridCol w:w="1584"/>
+      </w:tblGrid>
+      <w:tr>
+        <w:trPr>
+          <w:tblHeader w:val="true"/>
+        </w:trPr>
+        <w:tc>
+          <w:tcPr/>
+          <w:p>
+            <w:pPr>
+              <w:pStyle w:val="Compact"/>
+              <w:jc w:val="right"/>
+            </w:pPr>
+            <w:r>
+              <w:t xml:space="preserve">Matching distance (m)</w:t>
+            </w:r>
+          </w:p>
+        </w:tc>
+        <w:tc>
+          <w:tcPr/>
+          <w:p>
+            <w:pPr>
+              <w:pStyle w:val="Compact"/>
+              <w:jc w:val="right"/>
+            </w:pPr>
+            <w:r>
+              <w:t xml:space="preserve">Hotspot features</w:t>
+            </w:r>
+          </w:p>
+        </w:tc>
+        <w:tc>
+          <w:tcPr/>
+          <w:p>
+            <w:pPr>
+              <w:pStyle w:val="Compact"/>
+              <w:jc w:val="right"/>
+            </w:pPr>
+            <w:r>
+              <w:t xml:space="preserve">Unique matched features</w:t>
+            </w:r>
+          </w:p>
+        </w:tc>
+        <w:tc>
+          <w:tcPr/>
+          <w:p>
+            <w:pPr>
+              <w:pStyle w:val="Compact"/>
+              <w:jc w:val="right"/>
+            </w:pPr>
+            <w:r>
+              <w:t xml:space="preserve">Unmatched</w:t>
+            </w:r>
+          </w:p>
+        </w:tc>
+        <w:tc>
+          <w:tcPr/>
+          <w:p>
+            <w:pPr>
+              <w:pStyle w:val="Compact"/>
+              <w:jc w:val="right"/>
+            </w:pPr>
+            <w:r>
+              <w:t xml:space="preserve">Matched arcs</w:t>
+            </w:r>
+          </w:p>
+        </w:tc>
+      </w:tr>
+      <w:tr>
+        <w:tc>
+          <w:tcPr/>
+          <w:p>
+            <w:pPr>
+              <w:pStyle w:val="Compact"/>
+              <w:jc w:val="right"/>
+            </w:pPr>
+            <w:r>
+              <w:t xml:space="preserve">50</w:t>
+            </w:r>
+          </w:p>
+        </w:tc>
+        <w:tc>
+          <w:tcPr/>
+          <w:p>
+            <w:pPr>
+              <w:pStyle w:val="Compact"/>
+              <w:jc w:val="right"/>
+            </w:pPr>
+            <w:r>
+              <w:t xml:space="preserve">327</w:t>
+            </w:r>
+          </w:p>
+        </w:tc>
+        <w:tc>
+          <w:tcPr/>
+          <w:p>
+            <w:pPr>
+              <w:pStyle w:val="Compact"/>
+              <w:jc w:val="right"/>
+            </w:pPr>
+            <w:r>
+              <w:t xml:space="preserve">318</w:t>
+            </w:r>
+          </w:p>
+        </w:tc>
+        <w:tc>
+          <w:tcPr/>
+          <w:p>
+            <w:pPr>
+              <w:pStyle w:val="Compact"/>
+              <w:jc w:val="right"/>
+            </w:pPr>
+            <w:r>
+              <w:t xml:space="preserve">9</w:t>
+            </w:r>
+          </w:p>
+        </w:tc>
+        <w:tc>
+          <w:tcPr/>
+          <w:p>
+            <w:pPr>
+              <w:pStyle w:val="Compact"/>
+              <w:jc w:val="right"/>
+            </w:pPr>
+            <w:r>
+              <w:t xml:space="preserve">583</w:t>
+            </w:r>
+          </w:p>
+        </w:tc>
+      </w:tr>
+      <w:tr>
+        <w:tc>
+          <w:tcPr/>
+          <w:p>
+            <w:pPr>
+              <w:pStyle w:val="Compact"/>
+              <w:jc w:val="right"/>
+            </w:pPr>
+            <w:r>
+              <w:t xml:space="preserve">100</w:t>
+            </w:r>
+          </w:p>
+        </w:tc>
+        <w:tc>
+          <w:tcPr/>
+          <w:p>
+            <w:pPr>
+              <w:pStyle w:val="Compact"/>
+              <w:jc w:val="right"/>
+            </w:pPr>
+            <w:r>
+              <w:t xml:space="preserve">327</w:t>
+            </w:r>
+          </w:p>
+        </w:tc>
+        <w:tc>
+          <w:tcPr/>
+          <w:p>
+            <w:pPr>
+              <w:pStyle w:val="Compact"/>
+              <w:jc w:val="right"/>
+            </w:pPr>
+            <w:r>
+              <w:t xml:space="preserve">324</w:t>
+            </w:r>
+          </w:p>
+        </w:tc>
+        <w:tc>
+          <w:tcPr/>
+          <w:p>
+            <w:pPr>
+              <w:pStyle w:val="Compact"/>
+              <w:jc w:val="right"/>
+            </w:pPr>
+            <w:r>
+              <w:t xml:space="preserve">3</w:t>
+            </w:r>
+          </w:p>
+        </w:tc>
+        <w:tc>
+          <w:tcPr/>
+          <w:p>
+            <w:pPr>
+              <w:pStyle w:val="Compact"/>
+              <w:jc w:val="right"/>
+            </w:pPr>
+            <w:r>
+              <w:t xml:space="preserve">594</w:t>
+            </w:r>
+          </w:p>
+        </w:tc>
+      </w:tr>
+      <w:tr>
+        <w:tc>
+          <w:tcPr/>
+          <w:p>
+            <w:pPr>
+              <w:pStyle w:val="Compact"/>
+              <w:jc w:val="right"/>
+            </w:pPr>
+            <w:r>
+              <w:t xml:space="preserve">150</w:t>
+            </w:r>
+          </w:p>
+        </w:tc>
+        <w:tc>
+          <w:tcPr/>
+          <w:p>
+            <w:pPr>
+              <w:pStyle w:val="Compact"/>
+              <w:jc w:val="right"/>
+            </w:pPr>
+            <w:r>
+              <w:t xml:space="preserve">327</w:t>
+            </w:r>
+          </w:p>
+        </w:tc>
+        <w:tc>
+          <w:tcPr/>
+          <w:p>
+            <w:pPr>
+              <w:pStyle w:val="Compact"/>
+              <w:jc w:val="right"/>
+            </w:pPr>
+            <w:r>
+              <w:t xml:space="preserve">325</w:t>
+            </w:r>
+          </w:p>
+        </w:tc>
+        <w:tc>
+          <w:tcPr/>
+          <w:p>
+            <w:pPr>
+              <w:pStyle w:val="Compact"/>
+              <w:jc w:val="right"/>
+            </w:pPr>
+            <w:r>
+              <w:t xml:space="preserve">2</w:t>
+            </w:r>
+          </w:p>
+        </w:tc>
+        <w:tc>
+          <w:tcPr/>
+          <w:p>
+            <w:pPr>
+              <w:pStyle w:val="Compact"/>
+              <w:jc w:val="right"/>
+            </w:pPr>
+            <w:r>
+              <w:t xml:space="preserve">596</w:t>
+            </w:r>
+          </w:p>
+        </w:tc>
+      </w:tr>
+      <w:tr>
+        <w:tc>
+          <w:tcPr/>
+          <w:p>
+            <w:pPr>
+              <w:pStyle w:val="Compact"/>
+              <w:jc w:val="right"/>
+            </w:pPr>
+            <w:r>
+              <w:t xml:space="preserve">200</w:t>
+            </w:r>
+          </w:p>
+        </w:tc>
+        <w:tc>
+          <w:tcPr/>
+          <w:p>
+            <w:pPr>
+              <w:pStyle w:val="Compact"/>
+              <w:jc w:val="right"/>
+            </w:pPr>
+            <w:r>
+              <w:t xml:space="preserve">327</w:t>
+            </w:r>
+          </w:p>
+        </w:tc>
+        <w:tc>
+          <w:tcPr/>
+          <w:p>
+            <w:pPr>
+              <w:pStyle w:val="Compact"/>
+              <w:jc w:val="right"/>
+            </w:pPr>
+            <w:r>
+              <w:t xml:space="preserve">326</w:t>
+            </w:r>
+          </w:p>
+        </w:tc>
+        <w:tc>
+          <w:tcPr/>
+          <w:p>
+            <w:pPr>
+              <w:pStyle w:val="Compact"/>
+              <w:jc w:val="right"/>
+            </w:pPr>
+            <w:r>
+              <w:t xml:space="preserve">1</w:t>
+            </w:r>
+          </w:p>
+        </w:tc>
+        <w:tc>
+          <w:tcPr/>
+          <w:p>
+            <w:pPr>
+              <w:pStyle w:val="Compact"/>
+              <w:jc w:val="right"/>
+            </w:pPr>
+            <w:r>
+              <w:t xml:space="preserve">598</w:t>
+            </w:r>
+          </w:p>
+        </w:tc>
+      </w:tr>
+      <w:tr>
+        <w:tc>
+          <w:tcPr/>
+          <w:p>
+            <w:pPr>
+              <w:pStyle w:val="Compact"/>
+              <w:jc w:val="right"/>
+            </w:pPr>
+            <w:r>
+              <w:t xml:space="preserve">250</w:t>
+            </w:r>
+          </w:p>
+        </w:tc>
+        <w:tc>
+          <w:tcPr/>
+          <w:p>
+            <w:pPr>
+              <w:pStyle w:val="Compact"/>
+              <w:jc w:val="right"/>
+            </w:pPr>
+            <w:r>
+              <w:t xml:space="preserve">327</w:t>
+            </w:r>
+          </w:p>
+        </w:tc>
+        <w:tc>
+          <w:tcPr/>
+          <w:p>
+            <w:pPr>
+              <w:pStyle w:val="Compact"/>
+              <w:jc w:val="right"/>
+            </w:pPr>
+            <w:r>
+              <w:t xml:space="preserve">326</w:t>
+            </w:r>
+          </w:p>
+        </w:tc>
+        <w:tc>
+          <w:tcPr/>
+          <w:p>
+            <w:pPr>
+              <w:pStyle w:val="Compact"/>
+              <w:jc w:val="right"/>
+            </w:pPr>
+            <w:r>
+              <w:t xml:space="preserve">1</w:t>
+            </w:r>
+          </w:p>
+        </w:tc>
+        <w:tc>
+          <w:tcPr/>
+          <w:p>
+            <w:pPr>
+              <w:pStyle w:val="Compact"/>
+              <w:jc w:val="right"/>
+            </w:pPr>
+            <w:r>
+              <w:t xml:space="preserve">598</w:t>
+            </w:r>
+          </w:p>
+        </w:tc>
+      </w:tr>
+    </w:tbl>
+    <w:p/>
+    <w:tbl>
+      <w:tblPr>
+        <w:tblStyle w:val="Table"/>
+        <w:tblW w:type="pct" w:w="5000"/>
+        <w:tblLook w:firstRow="1" w:lastRow="0" w:firstColumn="0" w:lastColumn="0" w:noHBand="0" w:noVBand="0" w:val="0020"/>
+        <w:jc w:val="start"/>
+      </w:tblPr>
+      <w:tblGrid>
+        <w:gridCol w:w="2376"/>
+        <w:gridCol w:w="3168"/>
+        <w:gridCol w:w="2376"/>
+      </w:tblGrid>
+      <w:tr>
+        <w:trPr>
+          <w:tblHeader w:val="true"/>
+        </w:trPr>
+        <w:tc>
+          <w:tcPr/>
+          <w:p>
+            <w:pPr>
+              <w:pStyle w:val="Compact"/>
+              <w:jc w:val="left"/>
+            </w:pPr>
+            <w:r>
+              <w:t xml:space="preserve">Assigned scenario state at 150 m</w:t>
+            </w:r>
+          </w:p>
+        </w:tc>
+        <w:tc>
+          <w:tcPr/>
+          <w:p>
+            <w:pPr>
+              <w:pStyle w:val="Compact"/>
+              <w:jc w:val="right"/>
+            </w:pPr>
+            <w:r>
+              <w:t xml:space="preserve">Arc rows</w:t>
+            </w:r>
+          </w:p>
+        </w:tc>
+        <w:tc>
+          <w:tcPr/>
+          <w:p>
+            <w:pPr>
+              <w:pStyle w:val="Compact"/>
+              <w:jc w:val="left"/>
+            </w:pPr>
+            <w:r>
+              <w:t xml:space="preserve">Basis</w:t>
+            </w:r>
+          </w:p>
+        </w:tc>
+      </w:tr>
+      <w:tr>
+        <w:tc>
+          <w:tcPr/>
+          <w:p>
+            <w:pPr>
+              <w:pStyle w:val="Compact"/>
+              <w:jc w:val="left"/>
+            </w:pPr>
+            <w:r>
+              <w:t xml:space="preserve">BLOCKED</w:t>
+            </w:r>
+          </w:p>
+        </w:tc>
+        <w:tc>
+          <w:tcPr/>
+          <w:p>
+            <w:pPr>
+              <w:pStyle w:val="Compact"/>
+              <w:jc w:val="right"/>
+            </w:pPr>
+            <w:r>
+              <w:t xml:space="preserve">596</w:t>
+            </w:r>
+          </w:p>
+        </w:tc>
+        <w:tc>
+          <w:tcPr/>
+          <w:p>
+            <w:pPr>
+              <w:pStyle w:val="Compact"/>
+              <w:jc w:val="left"/>
+            </w:pPr>
+            <w:r>
+              <w:t xml:space="preserve">Historical hotspot nearest-arc rule (</w:t>
+            </w:r>
+            <w:r>
+              <w:rPr>
+                <w:bCs/>
+                <w:b/>
+              </w:rPr>
+              <w:t xml:space="preserve">SCENARIO</w:t>
+            </w:r>
+            <w:r>
+              <w:t xml:space="preserve">)</w:t>
+            </w:r>
+          </w:p>
+        </w:tc>
+      </w:tr>
+      <w:tr>
+        <w:tc>
+          <w:tcPr/>
+          <w:p>
+            <w:pPr>
+              <w:pStyle w:val="Compact"/>
+              <w:jc w:val="left"/>
+            </w:pPr>
+            <w:r>
+              <w:t xml:space="preserve">SEVERE</w:t>
+            </w:r>
+          </w:p>
+        </w:tc>
+        <w:tc>
+          <w:tcPr/>
+          <w:p>
+            <w:pPr>
+              <w:pStyle w:val="Compact"/>
+              <w:jc w:val="right"/>
+            </w:pPr>
+            <w:r>
+              <w:t xml:space="preserve">99,443</w:t>
+            </w:r>
+          </w:p>
+        </w:tc>
+        <w:tc>
+          <w:tcPr/>
+          <w:p>
+            <w:pPr>
+              <w:pStyle w:val="Compact"/>
+              <w:jc w:val="left"/>
+            </w:pPr>
+            <w:r>
+              <w:t xml:space="preserve">Historical inundation-polygon overlay (</w:t>
+            </w:r>
+            <w:r>
+              <w:rPr>
+                <w:bCs/>
+                <w:b/>
+              </w:rPr>
+              <w:t xml:space="preserve">SCENARIO</w:t>
+            </w:r>
+            <w:r>
+              <w:t xml:space="preserve">)</w:t>
+            </w:r>
+          </w:p>
+        </w:tc>
+      </w:tr>
+      <w:tr>
+        <w:tc>
+          <w:tcPr/>
+          <w:p>
+            <w:pPr>
+              <w:pStyle w:val="Compact"/>
+              <w:jc w:val="left"/>
+            </w:pPr>
+            <w:r>
+              <w:t xml:space="preserve">Conflicts (hotspot vs inundation)</w:t>
+            </w:r>
+          </w:p>
+        </w:tc>
+        <w:tc>
+          <w:tcPr/>
+          <w:p>
+            <w:pPr>
+              <w:pStyle w:val="Compact"/>
+              <w:jc w:val="right"/>
+            </w:pPr>
+            <w:r>
+              <w:t xml:space="preserve">269</w:t>
+            </w:r>
+          </w:p>
+        </w:tc>
+        <w:tc>
+          <w:tcPr/>
+          <w:p>
+            <w:pPr>
+              <w:pStyle w:val="Compact"/>
+              <w:jc w:val="left"/>
+            </w:pPr>
+            <w:r>
+              <w:t xml:space="preserve">Both rules applied; more severe kept</w:t>
+            </w:r>
+          </w:p>
+        </w:tc>
+      </w:tr>
+      <w:tr>
+        <w:tc>
+          <w:tcPr/>
+          <w:p>
+            <w:pPr>
+              <w:pStyle w:val="Compact"/>
+              <w:jc w:val="left"/>
+            </w:pPr>
+            <w:r>
+              <w:t xml:space="preserve">UNKNOWN / NORMAL</w:t>
+            </w:r>
+          </w:p>
+        </w:tc>
+        <w:tc>
+          <w:tcPr/>
+          <w:p>
+            <w:pPr>
+              <w:pStyle w:val="Compact"/>
+              <w:jc w:val="right"/>
+            </w:pPr>
+            <w:r>
+              <w:t xml:space="preserve">not tabulated</w:t>
+            </w:r>
+          </w:p>
+        </w:tc>
+        <w:tc>
+          <w:tcPr/>
+          <w:p>
+            <w:pPr>
+              <w:pStyle w:val="Compact"/>
+              <w:jc w:val="left"/>
+            </w:pPr>
+            <w:r>
+              <w:t xml:space="preserve">Default for unmapped arcs</w:t>
+            </w:r>
+          </w:p>
+        </w:tc>
+      </w:tr>
+    </w:tbl>
+    <w:p>
+      <w:pPr>
+        <w:pStyle w:val="BodyText"/>
+      </w:pPr>
+      <w:r>
+        <w:t xml:space="preserve">Open-Meteo ERA5 rainfall for 1 Nov–15 Dec 2015 at (13.0827, 80.2707) totals 731.7 mm over 1,080 hourly rows (</w:t>
+      </w:r>
+      <w:r>
+        <w:rPr>
+          <w:bCs/>
+          <w:b/>
+        </w:rPr>
+        <w:t xml:space="preserve">MODELLED</w:t>
+      </w:r>
+      <w:r>
+        <w:t xml:space="preserve"> </w:t>
+      </w:r>
+      <w:r>
+        <w:t xml:space="preserve">reanalysis, not street flooding). IMERG was</w:t>
+      </w:r>
+      <w:r>
+        <w:t xml:space="preserve"> </w:t>
+      </w:r>
+      <w:r>
+        <w:rPr>
+          <w:bCs/>
+          <w:b/>
+        </w:rPr>
+        <w:t xml:space="preserve">UNAVAILABLE</w:t>
+      </w:r>
+      <w:r>
+        <w:t xml:space="preserve"> </w:t>
+      </w:r>
+      <w:r>
+        <w:t xml:space="preserve">without Earthdata credentials.</w:t>
+      </w:r>
+    </w:p>
+    <w:bookmarkEnd w:id="58"/>
+    <w:bookmarkStart w:id="59" w:name="sumo-import-stage-5"/>
+    <w:p>
+      <w:pPr>
+        <w:pStyle w:val="Heading2"/>
+      </w:pPr>
+      <w:r>
+        <w:t xml:space="preserve">9.3 SUMO import (Stage 5)</w:t>
+      </w:r>
+    </w:p>
+    <w:p>
+      <w:pPr>
+        <w:pStyle w:val="FirstParagraph"/>
+      </w:pPr>
+      <w:r>
+        <w:t xml:space="preserve">Demand class:</w:t>
+      </w:r>
+      <w:r>
+        <w:t xml:space="preserve"> </w:t>
+      </w:r>
+      <w:r>
+        <w:rPr>
+          <w:bCs/>
+          <w:b/>
+        </w:rPr>
+        <w:t xml:space="preserve">SYNTHETIC</w:t>
+      </w:r>
+      <w:r>
+        <w:t xml:space="preserve">. Calibration class:</w:t>
+      </w:r>
+      <w:r>
+        <w:t xml:space="preserve"> </w:t>
+      </w:r>
+      <w:r>
+        <w:rPr>
+          <w:bCs/>
+          <w:b/>
+        </w:rPr>
+        <w:t xml:space="preserve">SYNTHETIC</w:t>
+      </w:r>
+      <w:r>
+        <w:t xml:space="preserve">. Vehicle types:</w:t>
+      </w:r>
+      <w:r>
+        <w:t xml:space="preserve"> </w:t>
+      </w:r>
+      <w:r>
+        <w:rPr>
+          <w:bCs/>
+          <w:b/>
+        </w:rPr>
+        <w:t xml:space="preserve">SCENARIO</w:t>
+      </w:r>
+      <w:r>
+        <w:t xml:space="preserve"> </w:t>
+      </w:r>
+      <w:r>
+        <w:t xml:space="preserve">labels.</w:t>
+      </w:r>
+    </w:p>
+    <w:tbl>
+      <w:tblPr>
+        <w:tblStyle w:val="Table"/>
+        <w:tblW w:type="pct" w:w="5000"/>
+        <w:tblLook w:firstRow="1" w:lastRow="0" w:firstColumn="0" w:lastColumn="0" w:noHBand="0" w:noVBand="0" w:val="0020"/>
+        <w:jc w:val="start"/>
+      </w:tblPr>
+      <w:tblGrid>
+        <w:gridCol w:w="3960"/>
+        <w:gridCol w:w="3960"/>
+      </w:tblGrid>
+      <w:tr>
+        <w:trPr>
+          <w:tblHeader w:val="true"/>
+        </w:trPr>
+        <w:tc>
+          <w:tcPr/>
+          <w:p>
+            <w:pPr>
+              <w:pStyle w:val="Compact"/>
+              <w:jc w:val="left"/>
+            </w:pPr>
+            <w:r>
+              <w:t xml:space="preserve">Item</w:t>
+            </w:r>
+          </w:p>
+        </w:tc>
+        <w:tc>
+          <w:tcPr/>
+          <w:p>
+            <w:pPr>
+              <w:pStyle w:val="Compact"/>
+              <w:jc w:val="left"/>
+            </w:pPr>
+            <w:r>
+              <w:t xml:space="preserve">Result</w:t>
+            </w:r>
+          </w:p>
+        </w:tc>
+      </w:tr>
+      <w:tr>
+        <w:tc>
+          <w:tcPr/>
+          <w:p>
+            <w:pPr>
+              <w:pStyle w:val="Compact"/>
+              <w:jc w:val="left"/>
+            </w:pPr>
+            <w:r>
+              <w:t xml:space="preserve">Public Chennai counts / OD / speeds</w:t>
+            </w:r>
+          </w:p>
+        </w:tc>
+        <w:tc>
+          <w:tcPr/>
+          <w:p>
+            <w:pPr>
+              <w:pStyle w:val="Compact"/>
+              <w:jc w:val="left"/>
+            </w:pPr>
+            <w:r>
+              <w:t xml:space="preserve">UNAVAILABLE</w:t>
+            </w:r>
+          </w:p>
+        </w:tc>
+      </w:tr>
+      <w:tr>
+        <w:tc>
+          <w:tcPr/>
+          <w:p>
+            <w:pPr>
+              <w:pStyle w:val="Compact"/>
+              <w:jc w:val="left"/>
+            </w:pPr>
+            <w:r>
+              <w:t xml:space="preserve">OSM</w:t>
+            </w:r>
+            <w:r>
+              <w:t xml:space="preserve"> </w:t>
+            </w:r>
+            <w:r>
+              <w:rPr>
+                <w:rStyle w:val="VerbatimChar"/>
+              </w:rPr>
+              <w:t xml:space="preserve">netconvert</w:t>
+            </w:r>
+            <w:r>
+              <w:t xml:space="preserve"> </w:t>
+            </w:r>
+            <w:r>
+              <w:t xml:space="preserve">of the GCC extract</w:t>
+            </w:r>
+          </w:p>
+        </w:tc>
+        <w:tc>
+          <w:tcPr/>
+          <w:p>
+            <w:pPr>
+              <w:pStyle w:val="Compact"/>
+              <w:jc w:val="left"/>
+            </w:pPr>
+            <w:r>
+              <w:t xml:space="preserve">FAIL (SUMO 1.18.0 RTree/junction-angle abort)</w:t>
+            </w:r>
+          </w:p>
+        </w:tc>
+      </w:tr>
+      <w:tr>
+        <w:tc>
+          <w:tcPr/>
+          <w:p>
+            <w:pPr>
+              <w:pStyle w:val="Compact"/>
+              <w:jc w:val="left"/>
+            </w:pPr>
+            <w:r>
+              <w:t xml:space="preserve">Import used instead</w:t>
+            </w:r>
+          </w:p>
+        </w:tc>
+        <w:tc>
+          <w:tcPr/>
+          <w:p>
+            <w:pPr>
+              <w:pStyle w:val="Compact"/>
+              <w:jc w:val="left"/>
+            </w:pPr>
+            <w:r>
+              <w:t xml:space="preserve">Stage 3 GraphML as SUMO node/edge files</w:t>
+            </w:r>
+          </w:p>
+        </w:tc>
+      </w:tr>
+      <w:tr>
+        <w:tc>
+          <w:tcPr/>
+          <w:p>
+            <w:pPr>
+              <w:pStyle w:val="Compact"/>
+              <w:jc w:val="left"/>
+            </w:pPr>
+            <w:r>
+              <w:t xml:space="preserve">SUMO edges / lanes / junctions</w:t>
+            </w:r>
+          </w:p>
+        </w:tc>
+        <w:tc>
+          <w:tcPr/>
+          <w:p>
+            <w:pPr>
+              <w:pStyle w:val="Compact"/>
+              <w:jc w:val="left"/>
+            </w:pPr>
+            <w:r>
+              <w:t xml:space="preserve">331,545 / 345,252 / 156,607</w:t>
+            </w:r>
+          </w:p>
+        </w:tc>
+      </w:tr>
+      <w:tr>
+        <w:tc>
+          <w:tcPr/>
+          <w:p>
+            <w:pPr>
+              <w:pStyle w:val="Compact"/>
+              <w:jc w:val="left"/>
+            </w:pPr>
+            <w:r>
+              <w:t xml:space="preserve">Observed OSM speeds used</w:t>
+            </w:r>
+          </w:p>
+        </w:tc>
+        <w:tc>
+          <w:tcPr/>
+          <w:p>
+            <w:pPr>
+              <w:pStyle w:val="Compact"/>
+              <w:jc w:val="left"/>
+            </w:pPr>
+            <w:r>
+              <w:t xml:space="preserve">6,092</w:t>
+            </w:r>
+          </w:p>
+        </w:tc>
+      </w:tr>
+      <w:tr>
+        <w:tc>
+          <w:tcPr/>
+          <w:p>
+            <w:pPr>
+              <w:pStyle w:val="Compact"/>
+              <w:jc w:val="left"/>
+            </w:pPr>
+            <w:r>
+              <w:t xml:space="preserve">SCENARIO default 30 km/h speeds</w:t>
+            </w:r>
+          </w:p>
+        </w:tc>
+        <w:tc>
+          <w:tcPr/>
+          <w:p>
+            <w:pPr>
+              <w:pStyle w:val="Compact"/>
+              <w:jc w:val="left"/>
+            </w:pPr>
+            <w:r>
+              <w:t xml:space="preserve">325,453</w:t>
+            </w:r>
+          </w:p>
+        </w:tc>
+      </w:tr>
+      <w:tr>
+        <w:tc>
+          <w:tcPr/>
+          <w:p>
+            <w:pPr>
+              <w:pStyle w:val="Compact"/>
+              <w:jc w:val="left"/>
+            </w:pPr>
+            <w:r>
+              <w:t xml:space="preserve">Seeded random trips</w:t>
+            </w:r>
+          </w:p>
+        </w:tc>
+        <w:tc>
+          <w:tcPr/>
+          <w:p>
+            <w:pPr>
+              <w:pStyle w:val="Compact"/>
+              <w:jc w:val="left"/>
+            </w:pPr>
+            <w:r>
+              <w:t xml:space="preserve">60 trips, seed 8597, 300 s</w:t>
+            </w:r>
+          </w:p>
+        </w:tc>
+      </w:tr>
+    </w:tbl>
+    <w:p>
+      <w:pPr>
+        <w:pStyle w:val="BodyText"/>
+      </w:pPr>
+      <w:r>
+        <w:t xml:space="preserve">SUMO output is simulated traffic. It is not live or counted Chennai traffic. City-scale CCH timings, turns, and closures remain Stage 6.</w:t>
       </w:r>
     </w:p>
     <w:p>
@@ -9562,8 +11028,9 @@
         </w:pict>
       </w:r>
     </w:p>
-    <w:bookmarkEnd w:id="57"/>
-    <w:bookmarkStart w:id="58" w:name="comparison-with-existing-algorithms"/>
+    <w:bookmarkEnd w:id="59"/>
+    <w:bookmarkEnd w:id="60"/>
+    <w:bookmarkStart w:id="61" w:name="comparison-with-existing-algorithms"/>
     <w:p>
       <w:pPr>
         <w:pStyle w:val="Heading1"/>
@@ -9577,7 +11044,7 @@
         <w:pStyle w:val="FirstParagraph"/>
       </w:pPr>
       <w:r>
-        <w:t xml:space="preserve">The assignment requires experimental comparison with at least two existing algorithms. The two baselines that will be compared with Certificate-Gated Routing are:</w:t>
+        <w:t xml:space="preserve">The two implemented baselines compared with Certificate-Gated Routing are:</w:t>
       </w:r>
     </w:p>
     <w:p>
@@ -9609,7 +11076,7 @@
         <w:pStyle w:val="FirstParagraph"/>
       </w:pPr>
       <w:r>
-        <w:t xml:space="preserve">Certificate-Gated Routing will use the same engine, same graph, same updates, same queries, and the same</w:t>
+        <w:t xml:space="preserve">Certificate-Gated Routing uses the same engine, same graph, same updates, same queries, and the same</w:t>
       </w:r>
       <w:r>
         <w:t xml:space="preserve"> </w:t>
@@ -9618,20 +11085,839 @@
         <m:r>
           <m:t>ε</m:t>
         </m:r>
+        <m:r>
+          <m:rPr>
+            <m:sty m:val="p"/>
+          </m:rPr>
+          <m:t>=</m:t>
+        </m:r>
+        <m:r>
+          <m:t>5</m:t>
+        </m:r>
+        <m:r>
+          <m:rPr>
+            <m:sty m:val="p"/>
+          </m:rPr>
+          <m:t>%</m:t>
+        </m:r>
       </m:oMath>
       <w:r>
         <w:t xml:space="preserve"> </w:t>
       </w:r>
       <w:r>
-        <w:t xml:space="preserve">as the matching eager method. The planned comparison parameters are execution time, number of customizations or rebuilds, certificate-bound violations, path-cost agreement with the Dijkstra oracle, and later Chennai-specific cost and access metrics. Memory will be reported only if it is actually instrumented.</w:t>
+        <w:t xml:space="preserve">as the matching eager method. City-scale comparison on the 331,545-arc Chennai graph is</w:t>
+      </w:r>
+      <w:r>
+        <w:t xml:space="preserve"> </w:t>
+      </w:r>
+      <w:r>
+        <w:rPr>
+          <w:bCs/>
+          <w:b/>
+        </w:rPr>
+        <w:t xml:space="preserve">not</w:t>
+      </w:r>
+      <w:r>
+        <w:t xml:space="preserve"> </w:t>
+      </w:r>
+      <w:r>
+        <w:t xml:space="preserve">in this table; that is Stage 6. The numbers below are the committed synthetic experiment (</w:t>
+      </w:r>
+      <w:r>
+        <w:rPr>
+          <w:rStyle w:val="VerbatimChar"/>
+        </w:rPr>
+        <w:t xml:space="preserve">docs/evidence/CERTIFIED_LAZY_SYNC_RESULTS.json</w:t>
+      </w:r>
+      <w:r>
+        <w:t xml:space="preserve">): 200 nodes, 600 extra arcs, 100 epochs, 5 updates and 50 queries per epoch, seed 8597.</w:t>
       </w:r>
     </w:p>
+    <w:tbl>
+      <w:tblPr>
+        <w:tblStyle w:val="Table"/>
+        <w:tblW w:type="pct" w:w="5000"/>
+        <w:tblLook w:firstRow="1" w:lastRow="0" w:firstColumn="0" w:lastColumn="0" w:noHBand="0" w:noVBand="0" w:val="0020"/>
+        <w:jc w:val="start"/>
+      </w:tblPr>
+      <w:tblGrid>
+        <w:gridCol w:w="792"/>
+        <w:gridCol w:w="792"/>
+        <w:gridCol w:w="1056"/>
+        <w:gridCol w:w="1056"/>
+        <w:gridCol w:w="1056"/>
+        <w:gridCol w:w="1056"/>
+        <w:gridCol w:w="1056"/>
+        <w:gridCol w:w="1056"/>
+      </w:tblGrid>
+      <w:tr>
+        <w:trPr>
+          <w:tblHeader w:val="true"/>
+        </w:trPr>
+        <w:tc>
+          <w:tcPr/>
+          <w:p>
+            <w:pPr>
+              <w:pStyle w:val="Compact"/>
+              <w:jc w:val="left"/>
+            </w:pPr>
+            <w:r>
+              <w:t xml:space="preserve">Engine</w:t>
+            </w:r>
+          </w:p>
+        </w:tc>
+        <w:tc>
+          <w:tcPr/>
+          <w:p>
+            <w:pPr>
+              <w:pStyle w:val="Compact"/>
+              <w:jc w:val="left"/>
+            </w:pPr>
+            <w:r>
+              <w:t xml:space="preserve">Update mode</w:t>
+            </w:r>
+          </w:p>
+        </w:tc>
+        <w:tc>
+          <w:tcPr/>
+          <w:p>
+            <w:pPr>
+              <w:pStyle w:val="Compact"/>
+              <w:jc w:val="right"/>
+            </w:pPr>
+            <w:r>
+              <w:t xml:space="preserve">Queries</w:t>
+            </w:r>
+          </w:p>
+        </w:tc>
+        <w:tc>
+          <w:tcPr/>
+          <w:p>
+            <w:pPr>
+              <w:pStyle w:val="Compact"/>
+              <w:jc w:val="right"/>
+            </w:pPr>
+            <w:r>
+              <w:t xml:space="preserve">Eager syncs</w:t>
+            </w:r>
+          </w:p>
+        </w:tc>
+        <w:tc>
+          <w:tcPr/>
+          <w:p>
+            <w:pPr>
+              <w:pStyle w:val="Compact"/>
+              <w:jc w:val="right"/>
+            </w:pPr>
+            <w:r>
+              <w:t xml:space="preserve">CLMS refreshes</w:t>
+            </w:r>
+          </w:p>
+        </w:tc>
+        <w:tc>
+          <w:tcPr/>
+          <w:p>
+            <w:pPr>
+              <w:pStyle w:val="Compact"/>
+              <w:jc w:val="right"/>
+            </w:pPr>
+            <w:r>
+              <w:t xml:space="preserve">Refreshes avoided</w:t>
+            </w:r>
+          </w:p>
+        </w:tc>
+        <w:tc>
+          <w:tcPr/>
+          <w:p>
+            <w:pPr>
+              <w:pStyle w:val="Compact"/>
+              <w:jc w:val="right"/>
+            </w:pPr>
+            <w:r>
+              <w:t xml:space="preserve">Certificate violations</w:t>
+            </w:r>
+          </w:p>
+        </w:tc>
+        <w:tc>
+          <w:tcPr/>
+          <w:p>
+            <w:pPr>
+              <w:pStyle w:val="Compact"/>
+              <w:jc w:val="right"/>
+            </w:pPr>
+            <w:r>
+              <w:t xml:space="preserve">Oracle mismatches</w:t>
+            </w:r>
+          </w:p>
+        </w:tc>
+      </w:tr>
+      <w:tr>
+        <w:tc>
+          <w:tcPr/>
+          <w:p>
+            <w:pPr>
+              <w:pStyle w:val="Compact"/>
+              <w:jc w:val="left"/>
+            </w:pPr>
+            <w:r>
+              <w:t xml:space="preserve">Dijkstra</w:t>
+            </w:r>
+          </w:p>
+        </w:tc>
+        <w:tc>
+          <w:tcPr/>
+          <w:p>
+            <w:pPr>
+              <w:pStyle w:val="Compact"/>
+              <w:jc w:val="left"/>
+            </w:pPr>
+            <w:r>
+              <w:t xml:space="preserve">increases only</w:t>
+            </w:r>
+          </w:p>
+        </w:tc>
+        <w:tc>
+          <w:tcPr/>
+          <w:p>
+            <w:pPr>
+              <w:pStyle w:val="Compact"/>
+              <w:jc w:val="right"/>
+            </w:pPr>
+            <w:r>
+              <w:t xml:space="preserve">5,000</w:t>
+            </w:r>
+          </w:p>
+        </w:tc>
+        <w:tc>
+          <w:tcPr/>
+          <w:p>
+            <w:pPr>
+              <w:pStyle w:val="Compact"/>
+              <w:jc w:val="right"/>
+            </w:pPr>
+            <w:r>
+              <w:t xml:space="preserve">101</w:t>
+            </w:r>
+          </w:p>
+        </w:tc>
+        <w:tc>
+          <w:tcPr/>
+          <w:p>
+            <w:pPr>
+              <w:pStyle w:val="Compact"/>
+              <w:jc w:val="right"/>
+            </w:pPr>
+            <w:r>
+              <w:t xml:space="preserve">6</w:t>
+            </w:r>
+          </w:p>
+        </w:tc>
+        <w:tc>
+          <w:tcPr/>
+          <w:p>
+            <w:pPr>
+              <w:pStyle w:val="Compact"/>
+              <w:jc w:val="right"/>
+            </w:pPr>
+            <w:r>
+              <w:t xml:space="preserve">94</w:t>
+            </w:r>
+          </w:p>
+        </w:tc>
+        <w:tc>
+          <w:tcPr/>
+          <w:p>
+            <w:pPr>
+              <w:pStyle w:val="Compact"/>
+              <w:jc w:val="right"/>
+            </w:pPr>
+            <w:r>
+              <w:t xml:space="preserve">0</w:t>
+            </w:r>
+          </w:p>
+        </w:tc>
+        <w:tc>
+          <w:tcPr/>
+          <w:p>
+            <w:pPr>
+              <w:pStyle w:val="Compact"/>
+              <w:jc w:val="right"/>
+            </w:pPr>
+            <w:r>
+              <w:t xml:space="preserve">0</w:t>
+            </w:r>
+          </w:p>
+        </w:tc>
+      </w:tr>
+      <w:tr>
+        <w:tc>
+          <w:tcPr/>
+          <w:p>
+            <w:pPr>
+              <w:pStyle w:val="Compact"/>
+              <w:jc w:val="left"/>
+            </w:pPr>
+            <w:r>
+              <w:t xml:space="preserve">Dijkstra</w:t>
+            </w:r>
+          </w:p>
+        </w:tc>
+        <w:tc>
+          <w:tcPr/>
+          <w:p>
+            <w:pPr>
+              <w:pStyle w:val="Compact"/>
+              <w:jc w:val="left"/>
+            </w:pPr>
+            <w:r>
+              <w:t xml:space="preserve">mixed</w:t>
+            </w:r>
+          </w:p>
+        </w:tc>
+        <w:tc>
+          <w:tcPr/>
+          <w:p>
+            <w:pPr>
+              <w:pStyle w:val="Compact"/>
+              <w:jc w:val="right"/>
+            </w:pPr>
+            <w:r>
+              <w:t xml:space="preserve">5,000</w:t>
+            </w:r>
+          </w:p>
+        </w:tc>
+        <w:tc>
+          <w:tcPr/>
+          <w:p>
+            <w:pPr>
+              <w:pStyle w:val="Compact"/>
+              <w:jc w:val="right"/>
+            </w:pPr>
+            <w:r>
+              <w:t xml:space="preserve">101</w:t>
+            </w:r>
+          </w:p>
+        </w:tc>
+        <w:tc>
+          <w:tcPr/>
+          <w:p>
+            <w:pPr>
+              <w:pStyle w:val="Compact"/>
+              <w:jc w:val="right"/>
+            </w:pPr>
+            <w:r>
+              <w:t xml:space="preserve">86</w:t>
+            </w:r>
+          </w:p>
+        </w:tc>
+        <w:tc>
+          <w:tcPr/>
+          <w:p>
+            <w:pPr>
+              <w:pStyle w:val="Compact"/>
+              <w:jc w:val="right"/>
+            </w:pPr>
+            <w:r>
+              <w:t xml:space="preserve">14</w:t>
+            </w:r>
+          </w:p>
+        </w:tc>
+        <w:tc>
+          <w:tcPr/>
+          <w:p>
+            <w:pPr>
+              <w:pStyle w:val="Compact"/>
+              <w:jc w:val="right"/>
+            </w:pPr>
+            <w:r>
+              <w:t xml:space="preserve">0</w:t>
+            </w:r>
+          </w:p>
+        </w:tc>
+        <w:tc>
+          <w:tcPr/>
+          <w:p>
+            <w:pPr>
+              <w:pStyle w:val="Compact"/>
+              <w:jc w:val="right"/>
+            </w:pPr>
+            <w:r>
+              <w:t xml:space="preserve">0</w:t>
+            </w:r>
+          </w:p>
+        </w:tc>
+      </w:tr>
+      <w:tr>
+        <w:tc>
+          <w:tcPr/>
+          <w:p>
+            <w:pPr>
+              <w:pStyle w:val="Compact"/>
+              <w:jc w:val="left"/>
+            </w:pPr>
+            <w:r>
+              <w:t xml:space="preserve">CCH</w:t>
+            </w:r>
+          </w:p>
+        </w:tc>
+        <w:tc>
+          <w:tcPr/>
+          <w:p>
+            <w:pPr>
+              <w:pStyle w:val="Compact"/>
+              <w:jc w:val="left"/>
+            </w:pPr>
+            <w:r>
+              <w:t xml:space="preserve">increases only</w:t>
+            </w:r>
+          </w:p>
+        </w:tc>
+        <w:tc>
+          <w:tcPr/>
+          <w:p>
+            <w:pPr>
+              <w:pStyle w:val="Compact"/>
+              <w:jc w:val="right"/>
+            </w:pPr>
+            <w:r>
+              <w:t xml:space="preserve">5,000</w:t>
+            </w:r>
+          </w:p>
+        </w:tc>
+        <w:tc>
+          <w:tcPr/>
+          <w:p>
+            <w:pPr>
+              <w:pStyle w:val="Compact"/>
+              <w:jc w:val="right"/>
+            </w:pPr>
+            <w:r>
+              <w:t xml:space="preserve">101</w:t>
+            </w:r>
+          </w:p>
+        </w:tc>
+        <w:tc>
+          <w:tcPr/>
+          <w:p>
+            <w:pPr>
+              <w:pStyle w:val="Compact"/>
+              <w:jc w:val="right"/>
+            </w:pPr>
+            <w:r>
+              <w:t xml:space="preserve">6</w:t>
+            </w:r>
+          </w:p>
+        </w:tc>
+        <w:tc>
+          <w:tcPr/>
+          <w:p>
+            <w:pPr>
+              <w:pStyle w:val="Compact"/>
+              <w:jc w:val="right"/>
+            </w:pPr>
+            <w:r>
+              <w:t xml:space="preserve">94</w:t>
+            </w:r>
+          </w:p>
+        </w:tc>
+        <w:tc>
+          <w:tcPr/>
+          <w:p>
+            <w:pPr>
+              <w:pStyle w:val="Compact"/>
+              <w:jc w:val="right"/>
+            </w:pPr>
+            <w:r>
+              <w:t xml:space="preserve">0</w:t>
+            </w:r>
+          </w:p>
+        </w:tc>
+        <w:tc>
+          <w:tcPr/>
+          <w:p>
+            <w:pPr>
+              <w:pStyle w:val="Compact"/>
+              <w:jc w:val="right"/>
+            </w:pPr>
+            <w:r>
+              <w:t xml:space="preserve">0</w:t>
+            </w:r>
+          </w:p>
+        </w:tc>
+      </w:tr>
+      <w:tr>
+        <w:tc>
+          <w:tcPr/>
+          <w:p>
+            <w:pPr>
+              <w:pStyle w:val="Compact"/>
+              <w:jc w:val="left"/>
+            </w:pPr>
+            <w:r>
+              <w:t xml:space="preserve">CCH</w:t>
+            </w:r>
+          </w:p>
+        </w:tc>
+        <w:tc>
+          <w:tcPr/>
+          <w:p>
+            <w:pPr>
+              <w:pStyle w:val="Compact"/>
+              <w:jc w:val="left"/>
+            </w:pPr>
+            <w:r>
+              <w:t xml:space="preserve">mixed</w:t>
+            </w:r>
+          </w:p>
+        </w:tc>
+        <w:tc>
+          <w:tcPr/>
+          <w:p>
+            <w:pPr>
+              <w:pStyle w:val="Compact"/>
+              <w:jc w:val="right"/>
+            </w:pPr>
+            <w:r>
+              <w:t xml:space="preserve">5,000</w:t>
+            </w:r>
+          </w:p>
+        </w:tc>
+        <w:tc>
+          <w:tcPr/>
+          <w:p>
+            <w:pPr>
+              <w:pStyle w:val="Compact"/>
+              <w:jc w:val="right"/>
+            </w:pPr>
+            <w:r>
+              <w:t xml:space="preserve">101</w:t>
+            </w:r>
+          </w:p>
+        </w:tc>
+        <w:tc>
+          <w:tcPr/>
+          <w:p>
+            <w:pPr>
+              <w:pStyle w:val="Compact"/>
+              <w:jc w:val="right"/>
+            </w:pPr>
+            <w:r>
+              <w:t xml:space="preserve">86</w:t>
+            </w:r>
+          </w:p>
+        </w:tc>
+        <w:tc>
+          <w:tcPr/>
+          <w:p>
+            <w:pPr>
+              <w:pStyle w:val="Compact"/>
+              <w:jc w:val="right"/>
+            </w:pPr>
+            <w:r>
+              <w:t xml:space="preserve">14</w:t>
+            </w:r>
+          </w:p>
+        </w:tc>
+        <w:tc>
+          <w:tcPr/>
+          <w:p>
+            <w:pPr>
+              <w:pStyle w:val="Compact"/>
+              <w:jc w:val="right"/>
+            </w:pPr>
+            <w:r>
+              <w:t xml:space="preserve">0</w:t>
+            </w:r>
+          </w:p>
+        </w:tc>
+        <w:tc>
+          <w:tcPr/>
+          <w:p>
+            <w:pPr>
+              <w:pStyle w:val="Compact"/>
+              <w:jc w:val="right"/>
+            </w:pPr>
+            <w:r>
+              <w:t xml:space="preserve">0</w:t>
+            </w:r>
+          </w:p>
+        </w:tc>
+      </w:tr>
+    </w:tbl>
+    <w:p/>
+    <w:tbl>
+      <w:tblPr>
+        <w:tblStyle w:val="Table"/>
+        <w:tblW w:type="auto" w:w="0"/>
+        <w:tblLook w:firstRow="1" w:lastRow="0" w:firstColumn="0" w:lastColumn="0" w:noHBand="0" w:noVBand="0" w:val="0020"/>
+        <w:jc w:val="start"/>
+      </w:tblPr>
+      <w:tblGrid>
+        <w:gridCol w:w="1980"/>
+        <w:gridCol w:w="1980"/>
+        <w:gridCol w:w="1980"/>
+        <w:gridCol w:w="1980"/>
+      </w:tblGrid>
+      <w:tr>
+        <w:trPr>
+          <w:tblHeader w:val="true"/>
+        </w:trPr>
+        <w:tc>
+          <w:tcPr/>
+          <w:p>
+            <w:pPr>
+              <w:pStyle w:val="Compact"/>
+              <w:jc w:val="left"/>
+            </w:pPr>
+            <w:r>
+              <w:t xml:space="preserve">Engine</w:t>
+            </w:r>
+          </w:p>
+        </w:tc>
+        <w:tc>
+          <w:tcPr/>
+          <w:p>
+            <w:pPr>
+              <w:pStyle w:val="Compact"/>
+              <w:jc w:val="left"/>
+            </w:pPr>
+            <w:r>
+              <w:t xml:space="preserve">Update mode</w:t>
+            </w:r>
+          </w:p>
+        </w:tc>
+        <w:tc>
+          <w:tcPr/>
+          <w:p>
+            <w:pPr>
+              <w:pStyle w:val="Compact"/>
+              <w:jc w:val="right"/>
+            </w:pPr>
+            <w:r>
+              <w:t xml:space="preserve">Eager total (s)</w:t>
+            </w:r>
+          </w:p>
+        </w:tc>
+        <w:tc>
+          <w:tcPr/>
+          <w:p>
+            <w:pPr>
+              <w:pStyle w:val="Compact"/>
+              <w:jc w:val="right"/>
+            </w:pPr>
+            <w:r>
+              <w:t xml:space="preserve">CLMS total (s)</w:t>
+            </w:r>
+          </w:p>
+        </w:tc>
+      </w:tr>
+      <w:tr>
+        <w:tc>
+          <w:tcPr/>
+          <w:p>
+            <w:pPr>
+              <w:pStyle w:val="Compact"/>
+              <w:jc w:val="left"/>
+            </w:pPr>
+            <w:r>
+              <w:t xml:space="preserve">Dijkstra</w:t>
+            </w:r>
+          </w:p>
+        </w:tc>
+        <w:tc>
+          <w:tcPr/>
+          <w:p>
+            <w:pPr>
+              <w:pStyle w:val="Compact"/>
+              <w:jc w:val="left"/>
+            </w:pPr>
+            <w:r>
+              <w:t xml:space="preserve">increases only</w:t>
+            </w:r>
+          </w:p>
+        </w:tc>
+        <w:tc>
+          <w:tcPr/>
+          <w:p>
+            <w:pPr>
+              <w:pStyle w:val="Compact"/>
+              <w:jc w:val="right"/>
+            </w:pPr>
+            <w:r>
+              <w:t xml:space="preserve">0.705</w:t>
+            </w:r>
+          </w:p>
+        </w:tc>
+        <w:tc>
+          <w:tcPr/>
+          <w:p>
+            <w:pPr>
+              <w:pStyle w:val="Compact"/>
+              <w:jc w:val="right"/>
+            </w:pPr>
+            <w:r>
+              <w:t xml:space="preserve">0.587</w:t>
+            </w:r>
+          </w:p>
+        </w:tc>
+      </w:tr>
+      <w:tr>
+        <w:tc>
+          <w:tcPr/>
+          <w:p>
+            <w:pPr>
+              <w:pStyle w:val="Compact"/>
+              <w:jc w:val="left"/>
+            </w:pPr>
+            <w:r>
+              <w:t xml:space="preserve">Dijkstra</w:t>
+            </w:r>
+          </w:p>
+        </w:tc>
+        <w:tc>
+          <w:tcPr/>
+          <w:p>
+            <w:pPr>
+              <w:pStyle w:val="Compact"/>
+              <w:jc w:val="left"/>
+            </w:pPr>
+            <w:r>
+              <w:t xml:space="preserve">mixed</w:t>
+            </w:r>
+          </w:p>
+        </w:tc>
+        <w:tc>
+          <w:tcPr/>
+          <w:p>
+            <w:pPr>
+              <w:pStyle w:val="Compact"/>
+              <w:jc w:val="right"/>
+            </w:pPr>
+            <w:r>
+              <w:t xml:space="preserve">0.736</w:t>
+            </w:r>
+          </w:p>
+        </w:tc>
+        <w:tc>
+          <w:tcPr/>
+          <w:p>
+            <w:pPr>
+              <w:pStyle w:val="Compact"/>
+              <w:jc w:val="right"/>
+            </w:pPr>
+            <w:r>
+              <w:t xml:space="preserve">0.707</w:t>
+            </w:r>
+          </w:p>
+        </w:tc>
+      </w:tr>
+      <w:tr>
+        <w:tc>
+          <w:tcPr/>
+          <w:p>
+            <w:pPr>
+              <w:pStyle w:val="Compact"/>
+              <w:jc w:val="left"/>
+            </w:pPr>
+            <w:r>
+              <w:t xml:space="preserve">CCH</w:t>
+            </w:r>
+          </w:p>
+        </w:tc>
+        <w:tc>
+          <w:tcPr/>
+          <w:p>
+            <w:pPr>
+              <w:pStyle w:val="Compact"/>
+              <w:jc w:val="left"/>
+            </w:pPr>
+            <w:r>
+              <w:t xml:space="preserve">increases only</w:t>
+            </w:r>
+          </w:p>
+        </w:tc>
+        <w:tc>
+          <w:tcPr/>
+          <w:p>
+            <w:pPr>
+              <w:pStyle w:val="Compact"/>
+              <w:jc w:val="right"/>
+            </w:pPr>
+            <w:r>
+              <w:t xml:space="preserve">0.203</w:t>
+            </w:r>
+          </w:p>
+        </w:tc>
+        <w:tc>
+          <w:tcPr/>
+          <w:p>
+            <w:pPr>
+              <w:pStyle w:val="Compact"/>
+              <w:jc w:val="right"/>
+            </w:pPr>
+            <w:r>
+              <w:t xml:space="preserve">0.120</w:t>
+            </w:r>
+          </w:p>
+        </w:tc>
+      </w:tr>
+      <w:tr>
+        <w:tc>
+          <w:tcPr/>
+          <w:p>
+            <w:pPr>
+              <w:pStyle w:val="Compact"/>
+              <w:jc w:val="left"/>
+            </w:pPr>
+            <w:r>
+              <w:t xml:space="preserve">CCH</w:t>
+            </w:r>
+          </w:p>
+        </w:tc>
+        <w:tc>
+          <w:tcPr/>
+          <w:p>
+            <w:pPr>
+              <w:pStyle w:val="Compact"/>
+              <w:jc w:val="left"/>
+            </w:pPr>
+            <w:r>
+              <w:t xml:space="preserve">mixed</w:t>
+            </w:r>
+          </w:p>
+        </w:tc>
+        <w:tc>
+          <w:tcPr/>
+          <w:p>
+            <w:pPr>
+              <w:pStyle w:val="Compact"/>
+              <w:jc w:val="right"/>
+            </w:pPr>
+            <w:r>
+              <w:t xml:space="preserve">0.202</w:t>
+            </w:r>
+          </w:p>
+        </w:tc>
+        <w:tc>
+          <w:tcPr/>
+          <w:p>
+            <w:pPr>
+              <w:pStyle w:val="Compact"/>
+              <w:jc w:val="right"/>
+            </w:pPr>
+            <w:r>
+              <w:t xml:space="preserve">0.209</w:t>
+            </w:r>
+          </w:p>
+        </w:tc>
+      </w:tr>
+    </w:tbl>
     <w:p>
       <w:pPr>
         <w:pStyle w:val="BodyText"/>
       </w:pPr>
       <w:r>
-        <w:t xml:space="preserve">No comparison table is included in this version. Tables will be added after Stages 4 and 5 from generated artifacts. A* / ALT will appear in the comparison only after that engine is implemented.</w:t>
+        <w:t xml:space="preserve">These are single-run synthetic wall-clock values. They are not Chennai traffic outcomes. Mixed workloads include weight decreases, which invalidate the stale lower bound and force refresh; CLMS then does not save customization work. A* / ALT is not implemented yet and is omitted.</w:t>
       </w:r>
     </w:p>
     <w:p>
@@ -9641,8 +11927,8 @@
         </w:pict>
       </w:r>
     </w:p>
-    <w:bookmarkEnd w:id="58"/>
-    <w:bookmarkStart w:id="59" w:name="results-and-discussion"/>
+    <w:bookmarkEnd w:id="61"/>
+    <w:bookmarkStart w:id="62" w:name="results-and-discussion"/>
     <w:p>
       <w:pPr>
         <w:pStyle w:val="Heading1"/>
@@ -9656,15 +11942,7 @@
         <w:pStyle w:val="FirstParagraph"/>
       </w:pPr>
       <w:r>
-        <w:t xml:space="preserve">Results are not claimed in this version because the comparison tables are deferred until Stages 4 and 5.</w:t>
-      </w:r>
-    </w:p>
-    <w:p>
-      <w:pPr>
-        <w:pStyle w:val="BodyText"/>
-      </w:pPr>
-      <w:r>
-        <w:t xml:space="preserve">From the algorithm itself, Certificate-Gated Routing is expected to reduce customization work when weights mostly nondecrease and</w:t>
+        <w:t xml:space="preserve">On the synthetic monotone-increase workload, Certificate-Gated Routing avoided 94 of 100 post-initial eager refreshes for both Dijkstra and CCH, with zero certificate violations and zero oracle mismatches. On the mixed increase/decrease workload it avoided only 14 of 100, as required by the decrease rule in Section 5. That matches the complexity discussion in Section 8: CLMS helps when weights mostly nondecrease and</w:t>
       </w:r>
       <w:r>
         <w:t xml:space="preserve"> </w:t>
@@ -9684,7 +11962,7 @@
         </m:r>
       </m:oMath>
       <w:r>
-        <w:t xml:space="preserve">, because many queries can reuse a stale metric inside the declared bound. It is not expected to help when recoveries (weight decreases) are frequent, because those decreases invalidate the stale lower bound and force refresh. It also cannot be cheaper than eager refresh in the worst case of a single query, as shown in Section 8.</w:t>
+        <w:t xml:space="preserve">, and does not help when recoveries are frequent.</w:t>
       </w:r>
     </w:p>
     <w:p>
@@ -9692,7 +11970,63 @@
         <w:pStyle w:val="BodyText"/>
       </w:pPr>
       <w:r>
-        <w:t xml:space="preserve">No statement is made that the method reduces Chennai congestion, emergency response time, or live flood routing. Those claims require the later experiments.</w:t>
+        <w:t xml:space="preserve">Stages 3–5 now supply a dated Chennai graph, historical flood overlays, and a</w:t>
+      </w:r>
+      <w:r>
+        <w:t xml:space="preserve"> </w:t>
+      </w:r>
+      <w:r>
+        <w:rPr>
+          <w:bCs/>
+          <w:b/>
+        </w:rPr>
+        <w:t xml:space="preserve">SYNTHETIC</w:t>
+      </w:r>
+      <w:r>
+        <w:t xml:space="preserve"> </w:t>
+      </w:r>
+      <w:r>
+        <w:t xml:space="preserve">SUMO scenario. They do</w:t>
+      </w:r>
+      <w:r>
+        <w:t xml:space="preserve"> </w:t>
+      </w:r>
+      <w:r>
+        <w:rPr>
+          <w:bCs/>
+          <w:b/>
+        </w:rPr>
+        <w:t xml:space="preserve">not</w:t>
+      </w:r>
+      <w:r>
+        <w:t xml:space="preserve"> </w:t>
+      </w:r>
+      <w:r>
+        <w:t xml:space="preserve">show that CLMS reduces Chennai congestion, emergency response time, or live flood routing. Most OSM arcs still lack explicit maxspeed. Inundation-polygon overlay marks tens of thousands of arcs SEVERE as a scenario, not as observed 2015 closures. City-scale CCH comparison remains Stage 6.</w:t>
+      </w:r>
+    </w:p>
+    <w:p>
+      <w:pPr>
+        <w:pStyle w:val="BodyText"/>
+      </w:pPr>
+      <w:r>
+        <w:t xml:space="preserve">No statement is made that the method is calibrated to Chennai traffic. Stage 5 labels the SUMO run</w:t>
+      </w:r>
+      <w:r>
+        <w:t xml:space="preserve"> </w:t>
+      </w:r>
+      <w:r>
+        <w:rPr>
+          <w:bCs/>
+          <w:b/>
+        </w:rPr>
+        <w:t xml:space="preserve">SYNTHETIC</w:t>
+      </w:r>
+      <w:r>
+        <w:t xml:space="preserve"> </w:t>
+      </w:r>
+      <w:r>
+        <w:t xml:space="preserve">because no public link counts or OD matrix were obtained.</w:t>
       </w:r>
     </w:p>
     <w:p>
@@ -9702,8 +12036,8 @@
         </w:pict>
       </w:r>
     </w:p>
-    <w:bookmarkEnd w:id="59"/>
-    <w:bookmarkStart w:id="60" w:name="conclusion"/>
+    <w:bookmarkEnd w:id="62"/>
+    <w:bookmarkStart w:id="63" w:name="conclusion"/>
     <w:p>
       <w:pPr>
         <w:pStyle w:val="Heading1"/>
@@ -9795,7 +12129,7 @@
         <w:t xml:space="preserve"> </w:t>
       </w:r>
       <w:r>
-        <w:t xml:space="preserve">The algorithm, proof under stated assumptions, complexity derivation, and literature comparison are complete. Implementation and baseline comparison tables will follow Stages 4 and 5.</w:t>
+        <w:t xml:space="preserve">The algorithm, proof under stated assumptions, complexity derivation, literature comparison, dated Chennai graph, historical road-state overlays, and a SYNTHETIC SUMO import are complete. City-scale CCH comparison (Stage 6) is not yet run.</w:t>
       </w:r>
     </w:p>
     <w:p>
@@ -9813,7 +12147,7 @@
         <w:t xml:space="preserve"> </w:t>
       </w:r>
       <w:r>
-        <w:t xml:space="preserve">The certificate is established prior art; CLMS is a controller, not a new shortest-path theorem. Prototype CCH is unoptimized. Closures on native CCH, turns, the city graph, flood evidence, and SUMO evaluation are incomplete. Extra space is</w:t>
+        <w:t xml:space="preserve">The certificate is established prior art; CLMS is a controller, not a new shortest-path theorem. Prototype CCH is unoptimized. Closures on native CCH and turn-expanded city queries remain unvalidated. Extra space is</w:t>
       </w:r>
       <w:r>
         <w:t xml:space="preserve"> </w:t>
@@ -9896,7 +12230,7 @@
         </m:d>
       </m:oMath>
       <w:r>
-        <w:t xml:space="preserve">.</w:t>
+        <w:t xml:space="preserve">. Most OSM maxspeed values are missing. SUMO demand is synthetic.</w:t>
       </w:r>
     </w:p>
     <w:p>
@@ -9906,8 +12240,8 @@
         </w:pict>
       </w:r>
     </w:p>
-    <w:bookmarkEnd w:id="60"/>
-    <w:bookmarkStart w:id="61" w:name="references"/>
+    <w:bookmarkEnd w:id="63"/>
+    <w:bookmarkStart w:id="64" w:name="references"/>
     <w:p>
       <w:pPr>
         <w:pStyle w:val="Heading1"/>
@@ -10495,8 +12829,8 @@
         </w:pict>
       </w:r>
     </w:p>
-    <w:bookmarkEnd w:id="61"/>
-    <w:bookmarkStart w:id="62" w:name="Xf646dbf70c4586f411be127f05f85146a16d6ef"/>
+    <w:bookmarkEnd w:id="64"/>
+    <w:bookmarkStart w:id="65" w:name="Xf646dbf70c4586f411be127f05f85146a16d6ef"/>
     <w:p>
       <w:pPr>
         <w:pStyle w:val="Heading1"/>
@@ -11109,7 +13443,7 @@
         <w:t xml:space="preserve">Chennai graph timings, flood-state accuracy, SUMO travel time, memory profiling, A* implementation numbers. Those will be added only from generated artifacts.</w:t>
       </w:r>
     </w:p>
-    <w:bookmarkEnd w:id="62"/>
+    <w:bookmarkEnd w:id="65"/>
     <w:sectPr>
       <w:headerReference r:id="rId9" w:type="default"/>
       <w:footerReference r:id="rId10" w:type="default"/>
@@ -23631,13 +25965,239 @@
       </w:tcPr>
     </w:tblStylePr>
   </w:style>
-  <w:style w:type="paragraph" w:customStyle="1" w:styleId="SourceCode">
+  <w:style w:customStyle="1" w:styleId="SourceCode" w:type="paragraph">
     <w:name w:val="Source Code"/>
     <w:basedOn w:val="Normal"/>
     <w:link w:val="VerbatimChar"/>
     <w:pPr>
       <w:wordWrap w:val="off"/>
     </w:pPr>
+  </w:style>
+  <w:style w:customStyle="1" w:styleId="KeywordTok" w:type="character">
+    <w:name w:val="KeywordTok"/>
+    <w:basedOn w:val="VerbatimChar"/>
+    <w:rPr>
+      <w:color w:val="007020"/>
+      <w:b/>
+    </w:rPr>
+  </w:style>
+  <w:style w:customStyle="1" w:styleId="DataTypeTok" w:type="character">
+    <w:name w:val="DataTypeTok"/>
+    <w:basedOn w:val="VerbatimChar"/>
+    <w:rPr>
+      <w:color w:val="902000"/>
+    </w:rPr>
+  </w:style>
+  <w:style w:customStyle="1" w:styleId="DecValTok" w:type="character">
+    <w:name w:val="DecValTok"/>
+    <w:basedOn w:val="VerbatimChar"/>
+    <w:rPr>
+      <w:color w:val="40a070"/>
+    </w:rPr>
+  </w:style>
+  <w:style w:customStyle="1" w:styleId="BaseNTok" w:type="character">
+    <w:name w:val="BaseNTok"/>
+    <w:basedOn w:val="VerbatimChar"/>
+    <w:rPr>
+      <w:color w:val="40a070"/>
+    </w:rPr>
+  </w:style>
+  <w:style w:customStyle="1" w:styleId="FloatTok" w:type="character">
+    <w:name w:val="FloatTok"/>
+    <w:basedOn w:val="VerbatimChar"/>
+    <w:rPr>
+      <w:color w:val="40a070"/>
+    </w:rPr>
+  </w:style>
+  <w:style w:customStyle="1" w:styleId="ConstantTok" w:type="character">
+    <w:name w:val="ConstantTok"/>
+    <w:basedOn w:val="VerbatimChar"/>
+    <w:rPr>
+      <w:color w:val="880000"/>
+    </w:rPr>
+  </w:style>
+  <w:style w:customStyle="1" w:styleId="CharTok" w:type="character">
+    <w:name w:val="CharTok"/>
+    <w:basedOn w:val="VerbatimChar"/>
+    <w:rPr>
+      <w:color w:val="4070a0"/>
+    </w:rPr>
+  </w:style>
+  <w:style w:customStyle="1" w:styleId="SpecialCharTok" w:type="character">
+    <w:name w:val="SpecialCharTok"/>
+    <w:basedOn w:val="VerbatimChar"/>
+    <w:rPr>
+      <w:color w:val="4070a0"/>
+    </w:rPr>
+  </w:style>
+  <w:style w:customStyle="1" w:styleId="StringTok" w:type="character">
+    <w:name w:val="StringTok"/>
+    <w:basedOn w:val="VerbatimChar"/>
+    <w:rPr>
+      <w:color w:val="4070a0"/>
+    </w:rPr>
+  </w:style>
+  <w:style w:customStyle="1" w:styleId="VerbatimStringTok" w:type="character">
+    <w:name w:val="VerbatimStringTok"/>
+    <w:basedOn w:val="VerbatimChar"/>
+    <w:rPr>
+      <w:color w:val="4070a0"/>
+    </w:rPr>
+  </w:style>
+  <w:style w:customStyle="1" w:styleId="SpecialStringTok" w:type="character">
+    <w:name w:val="SpecialStringTok"/>
+    <w:basedOn w:val="VerbatimChar"/>
+    <w:rPr>
+      <w:color w:val="bb6688"/>
+    </w:rPr>
+  </w:style>
+  <w:style w:customStyle="1" w:styleId="ImportTok" w:type="character">
+    <w:name w:val="ImportTok"/>
+    <w:basedOn w:val="VerbatimChar"/>
+    <w:rPr>
+      <w:color w:val="008000"/>
+      <w:b/>
+    </w:rPr>
+  </w:style>
+  <w:style w:customStyle="1" w:styleId="CommentTok" w:type="character">
+    <w:name w:val="CommentTok"/>
+    <w:basedOn w:val="VerbatimChar"/>
+    <w:rPr>
+      <w:color w:val="60a0b0"/>
+      <w:i/>
+    </w:rPr>
+  </w:style>
+  <w:style w:customStyle="1" w:styleId="DocumentationTok" w:type="character">
+    <w:name w:val="DocumentationTok"/>
+    <w:basedOn w:val="VerbatimChar"/>
+    <w:rPr>
+      <w:color w:val="ba2121"/>
+      <w:i/>
+    </w:rPr>
+  </w:style>
+  <w:style w:customStyle="1" w:styleId="AnnotationTok" w:type="character">
+    <w:name w:val="AnnotationTok"/>
+    <w:basedOn w:val="VerbatimChar"/>
+    <w:rPr>
+      <w:color w:val="60a0b0"/>
+      <w:b/>
+      <w:i/>
+    </w:rPr>
+  </w:style>
+  <w:style w:customStyle="1" w:styleId="CommentVarTok" w:type="character">
+    <w:name w:val="CommentVarTok"/>
+    <w:basedOn w:val="VerbatimChar"/>
+    <w:rPr>
+      <w:color w:val="60a0b0"/>
+      <w:b/>
+      <w:i/>
+    </w:rPr>
+  </w:style>
+  <w:style w:customStyle="1" w:styleId="OtherTok" w:type="character">
+    <w:name w:val="OtherTok"/>
+    <w:basedOn w:val="VerbatimChar"/>
+    <w:rPr>
+      <w:color w:val="007020"/>
+    </w:rPr>
+  </w:style>
+  <w:style w:customStyle="1" w:styleId="FunctionTok" w:type="character">
+    <w:name w:val="FunctionTok"/>
+    <w:basedOn w:val="VerbatimChar"/>
+    <w:rPr>
+      <w:color w:val="06287e"/>
+    </w:rPr>
+  </w:style>
+  <w:style w:customStyle="1" w:styleId="VariableTok" w:type="character">
+    <w:name w:val="VariableTok"/>
+    <w:basedOn w:val="VerbatimChar"/>
+    <w:rPr>
+      <w:color w:val="19177c"/>
+    </w:rPr>
+  </w:style>
+  <w:style w:customStyle="1" w:styleId="ControlFlowTok" w:type="character">
+    <w:name w:val="ControlFlowTok"/>
+    <w:basedOn w:val="VerbatimChar"/>
+    <w:rPr>
+      <w:color w:val="007020"/>
+      <w:b/>
+    </w:rPr>
+  </w:style>
+  <w:style w:customStyle="1" w:styleId="OperatorTok" w:type="character">
+    <w:name w:val="OperatorTok"/>
+    <w:basedOn w:val="VerbatimChar"/>
+    <w:rPr>
+      <w:color w:val="666666"/>
+    </w:rPr>
+  </w:style>
+  <w:style w:customStyle="1" w:styleId="BuiltInTok" w:type="character">
+    <w:name w:val="BuiltInTok"/>
+    <w:basedOn w:val="VerbatimChar"/>
+    <w:rPr>
+      <w:color w:val="008000"/>
+    </w:rPr>
+  </w:style>
+  <w:style w:customStyle="1" w:styleId="ExtensionTok" w:type="character">
+    <w:name w:val="ExtensionTok"/>
+    <w:basedOn w:val="VerbatimChar"/>
+    <w:rPr/>
+  </w:style>
+  <w:style w:customStyle="1" w:styleId="PreprocessorTok" w:type="character">
+    <w:name w:val="PreprocessorTok"/>
+    <w:basedOn w:val="VerbatimChar"/>
+    <w:rPr>
+      <w:color w:val="bc7a00"/>
+    </w:rPr>
+  </w:style>
+  <w:style w:customStyle="1" w:styleId="AttributeTok" w:type="character">
+    <w:name w:val="AttributeTok"/>
+    <w:basedOn w:val="VerbatimChar"/>
+    <w:rPr>
+      <w:color w:val="7d9029"/>
+    </w:rPr>
+  </w:style>
+  <w:style w:customStyle="1" w:styleId="RegionMarkerTok" w:type="character">
+    <w:name w:val="RegionMarkerTok"/>
+    <w:basedOn w:val="VerbatimChar"/>
+    <w:rPr/>
+  </w:style>
+  <w:style w:customStyle="1" w:styleId="InformationTok" w:type="character">
+    <w:name w:val="InformationTok"/>
+    <w:basedOn w:val="VerbatimChar"/>
+    <w:rPr>
+      <w:color w:val="60a0b0"/>
+      <w:b/>
+      <w:i/>
+    </w:rPr>
+  </w:style>
+  <w:style w:customStyle="1" w:styleId="WarningTok" w:type="character">
+    <w:name w:val="WarningTok"/>
+    <w:basedOn w:val="VerbatimChar"/>
+    <w:rPr>
+      <w:color w:val="60a0b0"/>
+      <w:b/>
+      <w:i/>
+    </w:rPr>
+  </w:style>
+  <w:style w:customStyle="1" w:styleId="AlertTok" w:type="character">
+    <w:name w:val="AlertTok"/>
+    <w:basedOn w:val="VerbatimChar"/>
+    <w:rPr>
+      <w:color w:val="ff0000"/>
+      <w:b/>
+    </w:rPr>
+  </w:style>
+  <w:style w:customStyle="1" w:styleId="ErrorTok" w:type="character">
+    <w:name w:val="ErrorTok"/>
+    <w:basedOn w:val="VerbatimChar"/>
+    <w:rPr>
+      <w:color w:val="ff0000"/>
+      <w:b/>
+    </w:rPr>
+  </w:style>
+  <w:style w:customStyle="1" w:styleId="NormalTok" w:type="character">
+    <w:name w:val="NormalTok"/>
+    <w:basedOn w:val="VerbatimChar"/>
+    <w:rPr/>
   </w:style>
   <w:style w:type="character" w:customStyle="1" w:styleId="KeywordTok">
     <w:name w:val="KeywordTok"/>

</xml_diff>

<commit_message>
Record Stage 6 inertial CCH evidence and DAA comparison tables
Inertial CCH on the Stage 3 graph matched NetworkX Dijkstra on 24/24
seeded queries. Closures use a finite geographic sentinel. Missing OSM
maxspeed stays a labelled SCENARIO 30 km/h default. Turn restrictions
are not modelled. The DAA Word file now includes those city-scale
tables. A number_of_edges call in the turn-model scan is no longer
inside the edge loop.

Co-authored-by: rohit michael <rohitmichael-alt@users.noreply.github.com>
</commit_message>
<xml_diff>
--- a/docs/DAA_ASSIGNMENT.docx
+++ b/docs/DAA_ASSIGNMENT.docx
@@ -159,7 +159,7 @@
         <w:pStyle w:val="BodyText"/>
       </w:pPr>
       <w:r>
-        <w:t xml:space="preserve">This document is the DAA assignment submission. It is separate from the longer project research-and-evidence file. Experimental tables below use Stage 3–5 artifacts plus the earlier synthetic certificate experiment. They do not claim calibrated Chennai traffic or city-scale CCH timings.</w:t>
+        <w:t xml:space="preserve">This document is the DAA assignment submission. It is separate from the longer project research-and-evidence file. Experimental tables below use Stage 3–6 artifacts plus the earlier synthetic certificate experiment. They do not claim calibrated Chennai traffic.</w:t>
       </w:r>
     </w:p>
     <w:p>
@@ -863,7 +863,7 @@
         <w:pStyle w:val="Compact"/>
       </w:pPr>
       <w:r>
-        <w:t xml:space="preserve">Weights are non-negative. Native CCH currently accepts</w:t>
+        <w:t xml:space="preserve">Weights are non-negative. Native CCH accepts</w:t>
       </w:r>
       <w:r>
         <w:t xml:space="preserve"> </w:t>
@@ -879,7 +879,7 @@
         <w:t xml:space="preserve"> </w:t>
       </w:r>
       <w:r>
-        <w:t xml:space="preserve">integers only;</w:t>
+        <w:t xml:space="preserve">integers only. Stage 6 represents closures with a geographic finite sentinel, not</w:t>
       </w:r>
       <w:r>
         <w:t xml:space="preserve"> </w:t>
@@ -899,10 +899,7 @@
         </m:r>
       </m:oMath>
       <w:r>
-        <w:t xml:space="preserve"> </w:t>
-      </w:r>
-      <w:r>
-        <w:t xml:space="preserve">closures are rejected until a later validation stage.</w:t>
+        <w:t xml:space="preserve">.</w:t>
       </w:r>
     </w:p>
     <w:p>
@@ -1046,7 +1043,7 @@
               <w:jc w:val="left"/>
             </w:pPr>
             <w:r>
-              <w:t xml:space="preserve">Stage 3 uses a dated extract clipped to the 2022 Greater Chennai Corporation ward union. City-graph timings are not reported in this file.</w:t>
+              <w:t xml:space="preserve">Stage 3 uses a dated extract clipped to the 2022 Greater Chennai Corporation ward union. Stage 6 reports CCH versus NetworkX Dijkstra on that graph.</w:t>
             </w:r>
           </w:p>
         </w:tc>
@@ -1072,7 +1069,7 @@
               <w:jc w:val="left"/>
             </w:pPr>
             <w:r>
-              <w:t xml:space="preserve">Scenario / synthetic until Stages 4–5</w:t>
+              <w:t xml:space="preserve">Scenario / mixed</w:t>
             </w:r>
           </w:p>
         </w:tc>
@@ -1084,7 +1081,7 @@
               <w:jc w:val="left"/>
             </w:pPr>
             <w:r>
-              <w:t xml:space="preserve">Later experiments will state whether weights are synthetic or derived from Chennai evidence.</w:t>
+              <w:t xml:space="preserve">Stage 6 travel times are milliseconds from length and speed. Missing OSM maxspeed uses a labelled SCENARIO 30 km/h default.</w:t>
             </w:r>
           </w:p>
         </w:tc>
@@ -9465,7 +9462,7 @@
         <w:t xml:space="preserve"> </w:t>
       </w:r>
       <w:r>
-        <w:t xml:space="preserve">and wall-clock time need not improve. That workload distinction will be measured after Stages 4 and 5.</w:t>
+        <w:t xml:space="preserve">and wall-clock time need not improve. That workload distinction is measured on the synthetic experiment in Section 10. City-scale CLMS is not yet run.</w:t>
       </w:r>
     </w:p>
     <w:p>
@@ -9477,7 +9474,7 @@
     </w:p>
     <w:bookmarkEnd w:id="55"/>
     <w:bookmarkEnd w:id="56"/>
-    <w:bookmarkStart w:id="60" w:name="implementation"/>
+    <w:bookmarkStart w:id="61" w:name="implementation"/>
     <w:p>
       <w:pPr>
         <w:pStyle w:val="Heading1"/>
@@ -9566,6 +9563,21 @@
           <w:rStyle w:val="NormalTok"/>
         </w:rPr>
         <w:t xml:space="preserve"> scripts/run_stage5_sumo.py</w:t>
+      </w:r>
+      <w:r>
+        <w:br/>
+      </w:r>
+      <w:r>
+        <w:rPr>
+          <w:rStyle w:val="ExtensionTok"/>
+        </w:rPr>
+        <w:t xml:space="preserve">python</w:t>
+      </w:r>
+      <w:r>
+        <w:rPr>
+          <w:rStyle w:val="NormalTok"/>
+        </w:rPr>
+        <w:t xml:space="preserve"> scripts/run_stage6_cch.py</w:t>
       </w:r>
       <w:r>
         <w:br/>
@@ -11018,7 +11030,785 @@
         <w:pStyle w:val="BodyText"/>
       </w:pPr>
       <w:r>
-        <w:t xml:space="preserve">SUMO output is simulated traffic. It is not live or counted Chennai traffic. City-scale CCH timings, turns, and closures remain Stage 6.</w:t>
+        <w:t xml:space="preserve">SUMO output is simulated traffic. It is not live or counted Chennai traffic.</w:t>
+      </w:r>
+    </w:p>
+    <w:bookmarkEnd w:id="59"/>
+    <w:bookmarkStart w:id="60" w:name="chennai-cch-stage-6"/>
+    <w:p>
+      <w:pPr>
+        <w:pStyle w:val="Heading2"/>
+      </w:pPr>
+      <w:r>
+        <w:t xml:space="preserve">9.4 Chennai CCH (Stage 6)</w:t>
+      </w:r>
+    </w:p>
+    <w:p>
+      <w:pPr>
+        <w:pStyle w:val="FirstParagraph"/>
+      </w:pPr>
+      <w:r>
+        <w:t xml:space="preserve">Decision:</w:t>
+      </w:r>
+      <w:r>
+        <w:t xml:space="preserve"> </w:t>
+      </w:r>
+      <w:r>
+        <w:rPr>
+          <w:bCs/>
+          <w:b/>
+        </w:rPr>
+        <w:t xml:space="preserve">PASS WITH LIMITATIONS</w:t>
+      </w:r>
+      <w:r>
+        <w:t xml:space="preserve">. Engine: RoutingKit CCH 0.1.4 with inertial (lat/lon) ordering. Oracle: NetworkX 3.6.1 Dijkstra. Metric: integer milliseconds. Seed 8597.</w:t>
+      </w:r>
+    </w:p>
+    <w:tbl>
+      <w:tblPr>
+        <w:tblStyle w:val="Table"/>
+        <w:tblW w:type="pct" w:w="5000"/>
+        <w:tblLook w:firstRow="1" w:lastRow="0" w:firstColumn="0" w:lastColumn="0" w:noHBand="0" w:noVBand="0" w:val="0020"/>
+        <w:jc w:val="start"/>
+      </w:tblPr>
+      <w:tblGrid>
+        <w:gridCol w:w="2640"/>
+        <w:gridCol w:w="2640"/>
+        <w:gridCol w:w="2640"/>
+      </w:tblGrid>
+      <w:tr>
+        <w:trPr>
+          <w:tblHeader w:val="true"/>
+        </w:trPr>
+        <w:tc>
+          <w:tcPr/>
+          <w:p>
+            <w:pPr>
+              <w:pStyle w:val="Compact"/>
+              <w:jc w:val="left"/>
+            </w:pPr>
+            <w:r>
+              <w:t xml:space="preserve">Item</w:t>
+            </w:r>
+          </w:p>
+        </w:tc>
+        <w:tc>
+          <w:tcPr/>
+          <w:p>
+            <w:pPr>
+              <w:pStyle w:val="Compact"/>
+              <w:jc w:val="left"/>
+            </w:pPr>
+            <w:r>
+              <w:t xml:space="preserve">Value</w:t>
+            </w:r>
+          </w:p>
+        </w:tc>
+        <w:tc>
+          <w:tcPr/>
+          <w:p>
+            <w:pPr>
+              <w:pStyle w:val="Compact"/>
+              <w:jc w:val="left"/>
+            </w:pPr>
+            <w:r>
+              <w:t xml:space="preserve">Classification</w:t>
+            </w:r>
+          </w:p>
+        </w:tc>
+      </w:tr>
+      <w:tr>
+        <w:tc>
+          <w:tcPr/>
+          <w:p>
+            <w:pPr>
+              <w:pStyle w:val="Compact"/>
+              <w:jc w:val="left"/>
+            </w:pPr>
+            <w:r>
+              <w:t xml:space="preserve">Order</w:t>
+            </w:r>
+          </w:p>
+        </w:tc>
+        <w:tc>
+          <w:tcPr/>
+          <w:p>
+            <w:pPr>
+              <w:pStyle w:val="Compact"/>
+              <w:jc w:val="left"/>
+            </w:pPr>
+            <w:r>
+              <w:t xml:space="preserve">inertial, OSM</w:t>
+            </w:r>
+            <w:r>
+              <w:t xml:space="preserve"> </w:t>
+            </w:r>
+            <m:oMath>
+              <m:r>
+                <m:t>y</m:t>
+              </m:r>
+            </m:oMath>
+            <w:r>
+              <w:t xml:space="preserve"> </w:t>
+            </w:r>
+            <w:r>
+              <w:t xml:space="preserve">= latitude,</w:t>
+            </w:r>
+            <w:r>
+              <w:t xml:space="preserve"> </w:t>
+            </w:r>
+            <m:oMath>
+              <m:r>
+                <m:t>x</m:t>
+              </m:r>
+            </m:oMath>
+            <w:r>
+              <w:t xml:space="preserve"> </w:t>
+            </w:r>
+            <w:r>
+              <w:t xml:space="preserve">= longitude</w:t>
+            </w:r>
+          </w:p>
+        </w:tc>
+        <w:tc>
+          <w:tcPr/>
+          <w:p>
+            <w:pPr>
+              <w:pStyle w:val="Compact"/>
+              <w:jc w:val="left"/>
+            </w:pPr>
+            <w:r>
+              <w:t xml:space="preserve">OBSERVED coordinates, SCENARIO order heuristic</w:t>
+            </w:r>
+          </w:p>
+        </w:tc>
+      </w:tr>
+      <w:tr>
+        <w:tc>
+          <w:tcPr/>
+          <w:p>
+            <w:pPr>
+              <w:pStyle w:val="Compact"/>
+              <w:jc w:val="left"/>
+            </w:pPr>
+            <w:r>
+              <w:t xml:space="preserve">Turn model</w:t>
+            </w:r>
+          </w:p>
+        </w:tc>
+        <w:tc>
+          <w:tcPr/>
+          <w:p>
+            <w:pPr>
+              <w:pStyle w:val="Compact"/>
+              <w:jc w:val="left"/>
+            </w:pPr>
+            <w:r>
+              <w:t xml:space="preserve">Directed OSM arcs; no restriction relations</w:t>
+            </w:r>
+          </w:p>
+        </w:tc>
+        <w:tc>
+          <w:tcPr/>
+          <w:p>
+            <w:pPr>
+              <w:pStyle w:val="Compact"/>
+              <w:jc w:val="left"/>
+            </w:pPr>
+            <w:r>
+              <w:t xml:space="preserve">UNAVAILABLE / restricted topology</w:t>
+            </w:r>
+          </w:p>
+        </w:tc>
+      </w:tr>
+      <w:tr>
+        <w:tc>
+          <w:tcPr/>
+          <w:p>
+            <w:pPr>
+              <w:pStyle w:val="Compact"/>
+              <w:jc w:val="left"/>
+            </w:pPr>
+            <w:r>
+              <w:t xml:space="preserve">OBSERVED maxspeed arcs</w:t>
+            </w:r>
+          </w:p>
+        </w:tc>
+        <w:tc>
+          <w:tcPr/>
+          <w:p>
+            <w:pPr>
+              <w:pStyle w:val="Compact"/>
+              <w:jc w:val="left"/>
+            </w:pPr>
+            <w:r>
+              <w:t xml:space="preserve">6,092</w:t>
+            </w:r>
+          </w:p>
+        </w:tc>
+        <w:tc>
+          <w:tcPr/>
+          <w:p>
+            <w:pPr>
+              <w:pStyle w:val="Compact"/>
+              <w:jc w:val="left"/>
+            </w:pPr>
+            <w:r>
+              <w:t xml:space="preserve">OBSERVED</w:t>
+            </w:r>
+          </w:p>
+        </w:tc>
+      </w:tr>
+      <w:tr>
+        <w:tc>
+          <w:tcPr/>
+          <w:p>
+            <w:pPr>
+              <w:pStyle w:val="Compact"/>
+              <w:jc w:val="left"/>
+            </w:pPr>
+            <w:r>
+              <w:t xml:space="preserve">SCENARIO 30 km/h arcs</w:t>
+            </w:r>
+          </w:p>
+        </w:tc>
+        <w:tc>
+          <w:tcPr/>
+          <w:p>
+            <w:pPr>
+              <w:pStyle w:val="Compact"/>
+              <w:jc w:val="left"/>
+            </w:pPr>
+            <w:r>
+              <w:t xml:space="preserve">325,453</w:t>
+            </w:r>
+          </w:p>
+        </w:tc>
+        <w:tc>
+          <w:tcPr/>
+          <w:p>
+            <w:pPr>
+              <w:pStyle w:val="Compact"/>
+              <w:jc w:val="left"/>
+            </w:pPr>
+            <w:r>
+              <w:t xml:space="preserve">SCENARIO</w:t>
+            </w:r>
+          </w:p>
+        </w:tc>
+      </w:tr>
+      <w:tr>
+        <w:tc>
+          <w:tcPr/>
+          <w:p>
+            <w:pPr>
+              <w:pStyle w:val="Compact"/>
+              <w:jc w:val="left"/>
+            </w:pPr>
+            <w:r>
+              <w:t xml:space="preserve">Quantization</w:t>
+            </w:r>
+          </w:p>
+        </w:tc>
+        <w:tc>
+          <w:tcPr/>
+          <w:p>
+            <w:pPr>
+              <w:pStyle w:val="Compact"/>
+              <w:jc w:val="left"/>
+            </w:pPr>
+            <w:r>
+              <w:t xml:space="preserve">round to 1 ms;</w:t>
+            </w:r>
+            <w:r>
+              <w:t xml:space="preserve"> </w:t>
+            </w:r>
+            <m:oMath>
+              <m:r>
+                <m:rPr>
+                  <m:sty m:val="p"/>
+                </m:rPr>
+                <m:t>≤</m:t>
+              </m:r>
+              <m:r>
+                <m:t>0.5</m:t>
+              </m:r>
+            </m:oMath>
+            <w:r>
+              <w:t xml:space="preserve"> </w:t>
+            </w:r>
+            <w:r>
+              <w:t xml:space="preserve">ms error per arc</w:t>
+            </w:r>
+          </w:p>
+        </w:tc>
+        <w:tc>
+          <w:tcPr/>
+          <w:p>
+            <w:pPr>
+              <w:pStyle w:val="Compact"/>
+              <w:jc w:val="left"/>
+            </w:pPr>
+            <w:r>
+              <w:t xml:space="preserve">SCENARIO representation</w:t>
+            </w:r>
+          </w:p>
+        </w:tc>
+      </w:tr>
+      <w:tr>
+        <w:tc>
+          <w:tcPr/>
+          <w:p>
+            <w:pPr>
+              <w:pStyle w:val="Compact"/>
+              <w:jc w:val="left"/>
+            </w:pPr>
+            <w:r>
+              <w:t xml:space="preserve">Geographic overflow bound</w:t>
+            </w:r>
+          </w:p>
+        </w:tc>
+        <w:tc>
+          <w:tcPr/>
+          <w:p>
+            <w:pPr>
+              <w:pStyle w:val="Compact"/>
+              <w:jc w:val="left"/>
+            </w:pPr>
+            <w:r>
+              <w:t xml:space="preserve">137,418,160 ms</w:t>
+            </w:r>
+          </w:p>
+        </w:tc>
+        <w:tc>
+          <w:tcPr/>
+          <w:p>
+            <w:pPr>
+              <w:pStyle w:val="Compact"/>
+              <w:jc w:val="left"/>
+            </w:pPr>
+            <w:r>
+              <w:t xml:space="preserve">SCENARIO (47.7 km diagonal, 5 km/h, detour 4)</w:t>
+            </w:r>
+          </w:p>
+        </w:tc>
+      </w:tr>
+      <w:tr>
+        <w:tc>
+          <w:tcPr/>
+          <w:p>
+            <w:pPr>
+              <w:pStyle w:val="Compact"/>
+              <w:jc w:val="left"/>
+            </w:pPr>
+            <w:r>
+              <w:t xml:space="preserve">Differential OD pairs</w:t>
+            </w:r>
+          </w:p>
+        </w:tc>
+        <w:tc>
+          <w:tcPr/>
+          <w:p>
+            <w:pPr>
+              <w:pStyle w:val="Compact"/>
+              <w:jc w:val="left"/>
+            </w:pPr>
+            <w:r>
+              <w:t xml:space="preserve">24</w:t>
+            </w:r>
+          </w:p>
+        </w:tc>
+        <w:tc>
+          <w:tcPr/>
+          <w:p>
+            <w:pPr>
+              <w:pStyle w:val="Compact"/>
+              <w:jc w:val="left"/>
+            </w:pPr>
+            <w:r>
+              <w:t xml:space="preserve">SCENARIO sample</w:t>
+            </w:r>
+          </w:p>
+        </w:tc>
+      </w:tr>
+      <w:tr>
+        <w:tc>
+          <w:tcPr/>
+          <w:p>
+            <w:pPr>
+              <w:pStyle w:val="Compact"/>
+              <w:jc w:val="left"/>
+            </w:pPr>
+            <w:r>
+              <w:t xml:space="preserve">Unpacked-cost mismatches</w:t>
+            </w:r>
+          </w:p>
+        </w:tc>
+        <w:tc>
+          <w:tcPr/>
+          <w:p>
+            <w:pPr>
+              <w:pStyle w:val="Compact"/>
+              <w:jc w:val="left"/>
+            </w:pPr>
+            <w:r>
+              <w:t xml:space="preserve">0</w:t>
+            </w:r>
+          </w:p>
+        </w:tc>
+        <w:tc>
+          <w:tcPr/>
+          <w:p>
+            <w:pPr>
+              <w:pStyle w:val="Compact"/>
+              <w:jc w:val="left"/>
+            </w:pPr>
+            <w:r>
+              <w:t xml:space="preserve">OBSERVED in this run</w:t>
+            </w:r>
+          </w:p>
+        </w:tc>
+      </w:tr>
+      <w:tr>
+        <w:tc>
+          <w:tcPr/>
+          <w:p>
+            <w:pPr>
+              <w:pStyle w:val="Compact"/>
+              <w:jc w:val="left"/>
+            </w:pPr>
+            <w:r>
+              <w:t xml:space="preserve">Closure sentinel arcs</w:t>
+            </w:r>
+          </w:p>
+        </w:tc>
+        <w:tc>
+          <w:tcPr/>
+          <w:p>
+            <w:pPr>
+              <w:pStyle w:val="Compact"/>
+              <w:jc w:val="left"/>
+            </w:pPr>
+            <w:r>
+              <w:t xml:space="preserve">20 Stage 4 BLOCKED overlays</w:t>
+            </w:r>
+          </w:p>
+        </w:tc>
+        <w:tc>
+          <w:tcPr/>
+          <w:p>
+            <w:pPr>
+              <w:pStyle w:val="Compact"/>
+              <w:jc w:val="left"/>
+            </w:pPr>
+            <w:r>
+              <w:t xml:space="preserve">SCENARIO</w:t>
+            </w:r>
+          </w:p>
+        </w:tc>
+      </w:tr>
+      <w:tr>
+        <w:tc>
+          <w:tcPr/>
+          <w:p>
+            <w:pPr>
+              <w:pStyle w:val="Compact"/>
+              <w:jc w:val="left"/>
+            </w:pPr>
+            <w:r>
+              <w:t xml:space="preserve">Closure / recovery mismatches</w:t>
+            </w:r>
+          </w:p>
+        </w:tc>
+        <w:tc>
+          <w:tcPr/>
+          <w:p>
+            <w:pPr>
+              <w:pStyle w:val="Compact"/>
+              <w:jc w:val="left"/>
+            </w:pPr>
+            <w:r>
+              <w:t xml:space="preserve">0 / 0</w:t>
+            </w:r>
+          </w:p>
+        </w:tc>
+        <w:tc>
+          <w:tcPr/>
+          <w:p>
+            <w:pPr>
+              <w:pStyle w:val="Compact"/>
+              <w:jc w:val="left"/>
+            </w:pPr>
+            <w:r>
+              <w:t xml:space="preserve">OBSERVED in this run</w:t>
+            </w:r>
+          </w:p>
+        </w:tc>
+      </w:tr>
+      <w:tr>
+        <w:tc>
+          <w:tcPr/>
+          <w:p>
+            <w:pPr>
+              <w:pStyle w:val="Compact"/>
+              <w:jc w:val="left"/>
+            </w:pPr>
+            <w:r>
+              <w:t xml:space="preserve">Paths using a closed arc</w:t>
+            </w:r>
+          </w:p>
+        </w:tc>
+        <w:tc>
+          <w:tcPr/>
+          <w:p>
+            <w:pPr>
+              <w:pStyle w:val="Compact"/>
+              <w:jc w:val="left"/>
+            </w:pPr>
+            <w:r>
+              <w:t xml:space="preserve">0 of 8 closure queries</w:t>
+            </w:r>
+          </w:p>
+        </w:tc>
+        <w:tc>
+          <w:tcPr/>
+          <w:p>
+            <w:pPr>
+              <w:pStyle w:val="Compact"/>
+              <w:jc w:val="left"/>
+            </w:pPr>
+            <w:r>
+              <w:t xml:space="preserve">OBSERVED in this run</w:t>
+            </w:r>
+          </w:p>
+        </w:tc>
+      </w:tr>
+    </w:tbl>
+    <w:p/>
+    <w:tbl>
+      <w:tblPr>
+        <w:tblStyle w:val="Table"/>
+        <w:tblW w:type="auto" w:w="0"/>
+        <w:tblLook w:firstRow="1" w:lastRow="0" w:firstColumn="0" w:lastColumn="0" w:noHBand="0" w:noVBand="0" w:val="0020"/>
+        <w:jc w:val="start"/>
+      </w:tblPr>
+      <w:tblGrid>
+        <w:gridCol w:w="3960"/>
+        <w:gridCol w:w="3960"/>
+      </w:tblGrid>
+      <w:tr>
+        <w:trPr>
+          <w:tblHeader w:val="true"/>
+        </w:trPr>
+        <w:tc>
+          <w:tcPr/>
+          <w:p>
+            <w:pPr>
+              <w:pStyle w:val="Compact"/>
+              <w:jc w:val="left"/>
+            </w:pPr>
+            <w:r>
+              <w:t xml:space="preserve">Timing (one machine, Python 3.12.3)</w:t>
+            </w:r>
+          </w:p>
+        </w:tc>
+        <w:tc>
+          <w:tcPr/>
+          <w:p>
+            <w:pPr>
+              <w:pStyle w:val="Compact"/>
+              <w:jc w:val="left"/>
+            </w:pPr>
+            <w:r>
+              <w:t xml:space="preserve">Value</w:t>
+            </w:r>
+          </w:p>
+        </w:tc>
+      </w:tr>
+      <w:tr>
+        <w:tc>
+          <w:tcPr/>
+          <w:p>
+            <w:pPr>
+              <w:pStyle w:val="Compact"/>
+              <w:jc w:val="left"/>
+            </w:pPr>
+            <w:r>
+              <w:t xml:space="preserve">Inertial order</w:t>
+            </w:r>
+          </w:p>
+        </w:tc>
+        <w:tc>
+          <w:tcPr/>
+          <w:p>
+            <w:pPr>
+              <w:pStyle w:val="Compact"/>
+              <w:jc w:val="left"/>
+            </w:pPr>
+            <w:r>
+              <w:t xml:space="preserve">2.75 s</w:t>
+            </w:r>
+          </w:p>
+        </w:tc>
+      </w:tr>
+      <w:tr>
+        <w:tc>
+          <w:tcPr/>
+          <w:p>
+            <w:pPr>
+              <w:pStyle w:val="Compact"/>
+              <w:jc w:val="left"/>
+            </w:pPr>
+            <w:r>
+              <w:t xml:space="preserve">CCH construct</w:t>
+            </w:r>
+          </w:p>
+        </w:tc>
+        <w:tc>
+          <w:tcPr/>
+          <w:p>
+            <w:pPr>
+              <w:pStyle w:val="Compact"/>
+              <w:jc w:val="left"/>
+            </w:pPr>
+            <w:r>
+              <w:t xml:space="preserve">1.66 s</w:t>
+            </w:r>
+          </w:p>
+        </w:tc>
+      </w:tr>
+      <w:tr>
+        <w:tc>
+          <w:tcPr/>
+          <w:p>
+            <w:pPr>
+              <w:pStyle w:val="Compact"/>
+              <w:jc w:val="left"/>
+            </w:pPr>
+            <w:r>
+              <w:t xml:space="preserve">Full customize</w:t>
+            </w:r>
+          </w:p>
+        </w:tc>
+        <w:tc>
+          <w:tcPr/>
+          <w:p>
+            <w:pPr>
+              <w:pStyle w:val="Compact"/>
+              <w:jc w:val="left"/>
+            </w:pPr>
+            <w:r>
+              <w:t xml:space="preserve">0.313 s</w:t>
+            </w:r>
+          </w:p>
+        </w:tc>
+      </w:tr>
+      <w:tr>
+        <w:tc>
+          <w:tcPr/>
+          <w:p>
+            <w:pPr>
+              <w:pStyle w:val="Compact"/>
+              <w:jc w:val="left"/>
+            </w:pPr>
+            <w:r>
+              <w:t xml:space="preserve">In-place metric reset</w:t>
+            </w:r>
+          </w:p>
+        </w:tc>
+        <w:tc>
+          <w:tcPr/>
+          <w:p>
+            <w:pPr>
+              <w:pStyle w:val="Compact"/>
+              <w:jc w:val="left"/>
+            </w:pPr>
+            <w:r>
+              <w:t xml:space="preserve">0.175 s</w:t>
+            </w:r>
+          </w:p>
+        </w:tc>
+      </w:tr>
+      <w:tr>
+        <w:tc>
+          <w:tcPr/>
+          <w:p>
+            <w:pPr>
+              <w:pStyle w:val="Compact"/>
+              <w:jc w:val="left"/>
+            </w:pPr>
+            <w:r>
+              <w:t xml:space="preserve">Mean CCH query (80 queries)</w:t>
+            </w:r>
+          </w:p>
+        </w:tc>
+        <w:tc>
+          <w:tcPr/>
+          <w:p>
+            <w:pPr>
+              <w:pStyle w:val="Compact"/>
+              <w:jc w:val="left"/>
+            </w:pPr>
+            <w:r>
+              <w:t xml:space="preserve">0.443 ms</w:t>
+            </w:r>
+          </w:p>
+        </w:tc>
+      </w:tr>
+      <w:tr>
+        <w:tc>
+          <w:tcPr/>
+          <w:p>
+            <w:pPr>
+              <w:pStyle w:val="Compact"/>
+              <w:jc w:val="left"/>
+            </w:pPr>
+            <w:r>
+              <w:t xml:space="preserve">Mean NetworkX Dijkstra query (24 queries)</w:t>
+            </w:r>
+          </w:p>
+        </w:tc>
+        <w:tc>
+          <w:tcPr/>
+          <w:p>
+            <w:pPr>
+              <w:pStyle w:val="Compact"/>
+              <w:jc w:val="left"/>
+            </w:pPr>
+            <w:r>
+              <w:t xml:space="preserve">160.3 ms</w:t>
+            </w:r>
+          </w:p>
+        </w:tc>
+      </w:tr>
+    </w:tbl>
+    <w:p>
+      <w:pPr>
+        <w:pStyle w:val="BodyText"/>
+      </w:pPr>
+      <w:r>
+        <w:t xml:space="preserve">CCH is retained for repeated queries on this represented metric relative to the NetworkX Dijkstra oracle. That is not a comparison with a tuned C++ Dijkstra, not a turn-restricted router, and not a Chennai traffic outcome. OSM-to-CCH maps are local (</w:t>
+      </w:r>
+      <w:r>
+        <w:rPr>
+          <w:rStyle w:val="VerbatimChar"/>
+        </w:rPr>
+        <w:t xml:space="preserve">data/processed/cch/</w:t>
+      </w:r>
+      <w:r>
+        <w:t xml:space="preserve">, SHA-256</w:t>
+      </w:r>
+      <w:r>
+        <w:t xml:space="preserve"> </w:t>
+      </w:r>
+      <w:r>
+        <w:rPr>
+          <w:rStyle w:val="VerbatimChar"/>
+        </w:rPr>
+        <w:t xml:space="preserve">4ac8e689f1ed1f58c7e4ff372d5615357d116f0b204abb02f6c3afc694311d2d</w:t>
+      </w:r>
+      <w:r>
+        <w:t xml:space="preserve">) and are not committed.</w:t>
       </w:r>
     </w:p>
     <w:p>
@@ -11028,9 +11818,9 @@
         </w:pict>
       </w:r>
     </w:p>
-    <w:bookmarkEnd w:id="59"/>
     <w:bookmarkEnd w:id="60"/>
-    <w:bookmarkStart w:id="61" w:name="comparison-with-existing-algorithms"/>
+    <w:bookmarkEnd w:id="61"/>
+    <w:bookmarkStart w:id="64" w:name="comparison-with-existing-algorithms"/>
     <w:p>
       <w:pPr>
         <w:pStyle w:val="Heading1"/>
@@ -11105,23 +11895,24 @@
         <w:t xml:space="preserve"> </w:t>
       </w:r>
       <w:r>
-        <w:t xml:space="preserve">as the matching eager method. City-scale comparison on the 331,545-arc Chennai graph is</w:t>
-      </w:r>
-      <w:r>
-        <w:t xml:space="preserve"> </w:t>
-      </w:r>
-      <w:r>
-        <w:rPr>
-          <w:bCs/>
-          <w:b/>
-        </w:rPr>
-        <w:t xml:space="preserve">not</w:t>
-      </w:r>
-      <w:r>
-        <w:t xml:space="preserve"> </w:t>
-      </w:r>
-      <w:r>
-        <w:t xml:space="preserve">in this table; that is Stage 6. The numbers below are the committed synthetic experiment (</w:t>
+        <w:t xml:space="preserve">as the matching eager method.</w:t>
+      </w:r>
+    </w:p>
+    <w:bookmarkStart w:id="62" w:name="synthetic-certificate-experiment"/>
+    <w:p>
+      <w:pPr>
+        <w:pStyle w:val="Heading2"/>
+      </w:pPr>
+      <w:r>
+        <w:t xml:space="preserve">10.1 Synthetic certificate experiment</w:t>
+      </w:r>
+    </w:p>
+    <w:p>
+      <w:pPr>
+        <w:pStyle w:val="FirstParagraph"/>
+      </w:pPr>
+      <w:r>
+        <w:t xml:space="preserve">City-scale CLMS was not re-run in Stage 6. The numbers below remain the committed synthetic experiment (</w:t>
       </w:r>
       <w:r>
         <w:rPr>
@@ -11920,6 +12711,253 @@
         <w:t xml:space="preserve">These are single-run synthetic wall-clock values. They are not Chennai traffic outcomes. Mixed workloads include weight decreases, which invalidate the stale lower bound and force refresh; CLMS then does not save customization work. A* / ALT is not implemented yet and is omitted.</w:t>
       </w:r>
     </w:p>
+    <w:bookmarkEnd w:id="62"/>
+    <w:bookmarkStart w:id="63" w:name="city-scale-cch-versus-dijkstra-stage-6"/>
+    <w:p>
+      <w:pPr>
+        <w:pStyle w:val="Heading2"/>
+      </w:pPr>
+      <w:r>
+        <w:t xml:space="preserve">10.2 City-scale CCH versus Dijkstra (Stage 6)</w:t>
+      </w:r>
+    </w:p>
+    <w:p>
+      <w:pPr>
+        <w:pStyle w:val="FirstParagraph"/>
+      </w:pPr>
+      <w:r>
+        <w:t xml:space="preserve">On the 331,545-arc Stage 3 graph, unpacked inertial CCH costs matched NetworkX Dijkstra on all 24 seeded queries (</w:t>
+      </w:r>
+      <w:r>
+        <w:rPr>
+          <w:rStyle w:val="VerbatimChar"/>
+        </w:rPr>
+        <w:t xml:space="preserve">docs/evidence/STAGE6_CCH_RESULTS.json</w:t>
+      </w:r>
+      <w:r>
+        <w:t xml:space="preserve">). Mean query time was 0.443 ms for CCH and 160.3 ms for this Dijkstra oracle. One full CCH customization took 0.313 s. Relative to</w:t>
+      </w:r>
+      <w:r>
+        <w:t xml:space="preserve"> </w:t>
+      </w:r>
+      <w:r>
+        <w:rPr>
+          <w:bCs/>
+          <w:b/>
+        </w:rPr>
+        <w:t xml:space="preserve">this</w:t>
+      </w:r>
+      <w:r>
+        <w:t xml:space="preserve"> </w:t>
+      </w:r>
+      <w:r>
+        <w:t xml:space="preserve">oracle, about two CCH queries amortize one customization. Certificate-gated CCH on the city graph is not in this table.</w:t>
+      </w:r>
+    </w:p>
+    <w:tbl>
+      <w:tblPr>
+        <w:tblStyle w:val="Table"/>
+        <w:tblW w:type="pct" w:w="5000"/>
+        <w:tblLook w:firstRow="1" w:lastRow="0" w:firstColumn="0" w:lastColumn="0" w:noHBand="0" w:noVBand="0" w:val="0020"/>
+        <w:jc w:val="start"/>
+      </w:tblPr>
+      <w:tblGrid>
+        <w:gridCol w:w="1397"/>
+        <w:gridCol w:w="1397"/>
+        <w:gridCol w:w="1863"/>
+        <w:gridCol w:w="1863"/>
+        <w:gridCol w:w="1397"/>
+      </w:tblGrid>
+      <w:tr>
+        <w:trPr>
+          <w:tblHeader w:val="true"/>
+        </w:trPr>
+        <w:tc>
+          <w:tcPr/>
+          <w:p>
+            <w:pPr>
+              <w:pStyle w:val="Compact"/>
+              <w:jc w:val="left"/>
+            </w:pPr>
+            <w:r>
+              <w:t xml:space="preserve">Engine</w:t>
+            </w:r>
+          </w:p>
+        </w:tc>
+        <w:tc>
+          <w:tcPr/>
+          <w:p>
+            <w:pPr>
+              <w:pStyle w:val="Compact"/>
+              <w:jc w:val="left"/>
+            </w:pPr>
+            <w:r>
+              <w:t xml:space="preserve">Graph</w:t>
+            </w:r>
+          </w:p>
+        </w:tc>
+        <w:tc>
+          <w:tcPr/>
+          <w:p>
+            <w:pPr>
+              <w:pStyle w:val="Compact"/>
+              <w:jc w:val="right"/>
+            </w:pPr>
+            <w:r>
+              <w:t xml:space="preserve">Queries</w:t>
+            </w:r>
+          </w:p>
+        </w:tc>
+        <w:tc>
+          <w:tcPr/>
+          <w:p>
+            <w:pPr>
+              <w:pStyle w:val="Compact"/>
+              <w:jc w:val="right"/>
+            </w:pPr>
+            <w:r>
+              <w:t xml:space="preserve">Cost mismatches vs Dijkstra</w:t>
+            </w:r>
+          </w:p>
+        </w:tc>
+        <w:tc>
+          <w:tcPr/>
+          <w:p>
+            <w:pPr>
+              <w:pStyle w:val="Compact"/>
+              <w:jc w:val="left"/>
+            </w:pPr>
+            <w:r>
+              <w:t xml:space="preserve">Mean query</w:t>
+            </w:r>
+          </w:p>
+        </w:tc>
+      </w:tr>
+      <w:tr>
+        <w:tc>
+          <w:tcPr/>
+          <w:p>
+            <w:pPr>
+              <w:pStyle w:val="Compact"/>
+              <w:jc w:val="left"/>
+            </w:pPr>
+            <w:r>
+              <w:t xml:space="preserve">NetworkX Dijkstra (oracle)</w:t>
+            </w:r>
+          </w:p>
+        </w:tc>
+        <w:tc>
+          <w:tcPr/>
+          <w:p>
+            <w:pPr>
+              <w:pStyle w:val="Compact"/>
+              <w:jc w:val="left"/>
+            </w:pPr>
+            <w:r>
+              <w:t xml:space="preserve">Stage 3 Chennai</w:t>
+            </w:r>
+          </w:p>
+        </w:tc>
+        <w:tc>
+          <w:tcPr/>
+          <w:p>
+            <w:pPr>
+              <w:pStyle w:val="Compact"/>
+              <w:jc w:val="right"/>
+            </w:pPr>
+            <w:r>
+              <w:t xml:space="preserve">24</w:t>
+            </w:r>
+          </w:p>
+        </w:tc>
+        <w:tc>
+          <w:tcPr/>
+          <w:p>
+            <w:pPr>
+              <w:pStyle w:val="Compact"/>
+              <w:jc w:val="right"/>
+            </w:pPr>
+            <w:r>
+              <w:t xml:space="preserve">—</w:t>
+            </w:r>
+          </w:p>
+        </w:tc>
+        <w:tc>
+          <w:tcPr/>
+          <w:p>
+            <w:pPr>
+              <w:pStyle w:val="Compact"/>
+              <w:jc w:val="left"/>
+            </w:pPr>
+            <w:r>
+              <w:t xml:space="preserve">160.3 ms</w:t>
+            </w:r>
+          </w:p>
+        </w:tc>
+      </w:tr>
+      <w:tr>
+        <w:tc>
+          <w:tcPr/>
+          <w:p>
+            <w:pPr>
+              <w:pStyle w:val="Compact"/>
+              <w:jc w:val="left"/>
+            </w:pPr>
+            <w:r>
+              <w:t xml:space="preserve">RoutingKit CCH (inertial)</w:t>
+            </w:r>
+          </w:p>
+        </w:tc>
+        <w:tc>
+          <w:tcPr/>
+          <w:p>
+            <w:pPr>
+              <w:pStyle w:val="Compact"/>
+              <w:jc w:val="left"/>
+            </w:pPr>
+            <w:r>
+              <w:t xml:space="preserve">Stage 3 Chennai</w:t>
+            </w:r>
+          </w:p>
+        </w:tc>
+        <w:tc>
+          <w:tcPr/>
+          <w:p>
+            <w:pPr>
+              <w:pStyle w:val="Compact"/>
+              <w:jc w:val="right"/>
+            </w:pPr>
+            <w:r>
+              <w:t xml:space="preserve">80</w:t>
+            </w:r>
+          </w:p>
+        </w:tc>
+        <w:tc>
+          <w:tcPr/>
+          <w:p>
+            <w:pPr>
+              <w:pStyle w:val="Compact"/>
+              <w:jc w:val="right"/>
+            </w:pPr>
+            <w:r>
+              <w:t xml:space="preserve">0 of 24 paired</w:t>
+            </w:r>
+          </w:p>
+        </w:tc>
+        <w:tc>
+          <w:tcPr/>
+          <w:p>
+            <w:pPr>
+              <w:pStyle w:val="Compact"/>
+              <w:jc w:val="left"/>
+            </w:pPr>
+            <w:r>
+              <w:t xml:space="preserve">0.443 ms</w:t>
+            </w:r>
+          </w:p>
+        </w:tc>
+      </w:tr>
+    </w:tbl>
     <w:p>
       <w:r>
         <w:pict>
@@ -11927,8 +12965,9 @@
         </w:pict>
       </w:r>
     </w:p>
-    <w:bookmarkEnd w:id="61"/>
-    <w:bookmarkStart w:id="62" w:name="results-and-discussion"/>
+    <w:bookmarkEnd w:id="63"/>
+    <w:bookmarkEnd w:id="64"/>
+    <w:bookmarkStart w:id="65" w:name="results-and-discussion"/>
     <w:p>
       <w:pPr>
         <w:pStyle w:val="Heading1"/>
@@ -11970,7 +13009,7 @@
         <w:pStyle w:val="BodyText"/>
       </w:pPr>
       <w:r>
-        <w:t xml:space="preserve">Stages 3–5 now supply a dated Chennai graph, historical flood overlays, and a</w:t>
+        <w:t xml:space="preserve">Stages 3–6 now supply a dated Chennai graph, historical flood overlays, a</w:t>
       </w:r>
       <w:r>
         <w:t xml:space="preserve"> </w:t>
@@ -11986,7 +13025,7 @@
         <w:t xml:space="preserve"> </w:t>
       </w:r>
       <w:r>
-        <w:t xml:space="preserve">SUMO scenario. They do</w:t>
+        <w:t xml:space="preserve">SUMO scenario, and a city-scale CCH that matched Dijkstra on the declared millisecond metric. They do</w:t>
       </w:r>
       <w:r>
         <w:t xml:space="preserve"> </w:t>
@@ -12002,7 +13041,7 @@
         <w:t xml:space="preserve"> </w:t>
       </w:r>
       <w:r>
-        <w:t xml:space="preserve">show that CLMS reduces Chennai congestion, emergency response time, or live flood routing. Most OSM arcs still lack explicit maxspeed. Inundation-polygon overlay marks tens of thousands of arcs SEVERE as a scenario, not as observed 2015 closures. City-scale CCH comparison remains Stage 6.</w:t>
+        <w:t xml:space="preserve">show that CLMS reduces Chennai congestion, emergency response time, or live flood routing. Most OSM arcs still lack explicit maxspeed. Inundation-polygon overlay marks tens of thousands of arcs SEVERE as a scenario, not as observed 2015 closures. Turn restrictions are not modelled.</w:t>
       </w:r>
     </w:p>
     <w:p>
@@ -12026,7 +13065,7 @@
         <w:t xml:space="preserve"> </w:t>
       </w:r>
       <w:r>
-        <w:t xml:space="preserve">because no public link counts or OD matrix were obtained.</w:t>
+        <w:t xml:space="preserve">because no public link counts or OD matrix were obtained. Stage 6 timings compare CCH with NetworkX Dijkstra, not with a production C++ Dijkstra.</w:t>
       </w:r>
     </w:p>
     <w:p>
@@ -12036,8 +13075,8 @@
         </w:pict>
       </w:r>
     </w:p>
-    <w:bookmarkEnd w:id="62"/>
-    <w:bookmarkStart w:id="63" w:name="conclusion"/>
+    <w:bookmarkEnd w:id="65"/>
+    <w:bookmarkStart w:id="66" w:name="conclusion"/>
     <w:p>
       <w:pPr>
         <w:pStyle w:val="Heading1"/>
@@ -12129,7 +13168,7 @@
         <w:t xml:space="preserve"> </w:t>
       </w:r>
       <w:r>
-        <w:t xml:space="preserve">The algorithm, proof under stated assumptions, complexity derivation, literature comparison, dated Chennai graph, historical road-state overlays, and a SYNTHETIC SUMO import are complete. City-scale CCH comparison (Stage 6) is not yet run.</w:t>
+        <w:t xml:space="preserve">The algorithm, proof under stated assumptions, complexity derivation, literature comparison, dated Chennai graph, historical road-state overlays, a SYNTHETIC SUMO import, and Stage 6 inertial CCH versus Dijkstra are complete. Certificate-gated city-scale CLMS and Stage 7 rerouting are not yet run.</w:t>
       </w:r>
     </w:p>
     <w:p>
@@ -12147,7 +13186,7 @@
         <w:t xml:space="preserve"> </w:t>
       </w:r>
       <w:r>
-        <w:t xml:space="preserve">The certificate is established prior art; CLMS is a controller, not a new shortest-path theorem. Prototype CCH is unoptimized. Closures on native CCH and turn-expanded city queries remain unvalidated. Extra space is</w:t>
+        <w:t xml:space="preserve">The certificate is established prior art; CLMS is a controller, not a new shortest-path theorem. Closures on native CCH use a finite geographic sentinel. Turn-expanded city queries are not modelled. Extra space is</w:t>
       </w:r>
       <w:r>
         <w:t xml:space="preserve"> </w:t>
@@ -12230,7 +13269,7 @@
         </m:d>
       </m:oMath>
       <w:r>
-        <w:t xml:space="preserve">. Most OSM maxspeed values are missing. SUMO demand is synthetic.</w:t>
+        <w:t xml:space="preserve">. Most OSM maxspeed values are missing. SUMO demand is synthetic. City CCH speed is versus NetworkX Dijkstra.</w:t>
       </w:r>
     </w:p>
     <w:p>
@@ -12240,8 +13279,8 @@
         </w:pict>
       </w:r>
     </w:p>
-    <w:bookmarkEnd w:id="63"/>
-    <w:bookmarkStart w:id="64" w:name="references"/>
+    <w:bookmarkEnd w:id="66"/>
+    <w:bookmarkStart w:id="67" w:name="references"/>
     <w:p>
       <w:pPr>
         <w:pStyle w:val="Heading1"/>
@@ -12829,8 +13868,8 @@
         </w:pict>
       </w:r>
     </w:p>
-    <w:bookmarkEnd w:id="64"/>
-    <w:bookmarkStart w:id="65" w:name="Xf646dbf70c4586f411be127f05f85146a16d6ef"/>
+    <w:bookmarkEnd w:id="67"/>
+    <w:bookmarkStart w:id="68" w:name="Xf646dbf70c4586f411be127f05f85146a16d6ef"/>
     <w:p>
       <w:pPr>
         <w:pStyle w:val="Heading1"/>
@@ -13443,7 +14482,7 @@
         <w:t xml:space="preserve">Chennai graph timings, flood-state accuracy, SUMO travel time, memory profiling, A* implementation numbers. Those will be added only from generated artifacts.</w:t>
       </w:r>
     </w:p>
-    <w:bookmarkEnd w:id="65"/>
+    <w:bookmarkEnd w:id="68"/>
     <w:sectPr>
       <w:headerReference r:id="rId9" w:type="default"/>
       <w:footerReference r:id="rId10" w:type="default"/>
@@ -25972,6 +27011,458 @@
     <w:pPr>
       <w:wordWrap w:val="off"/>
     </w:pPr>
+  </w:style>
+  <w:style w:customStyle="1" w:styleId="KeywordTok" w:type="character">
+    <w:name w:val="KeywordTok"/>
+    <w:basedOn w:val="VerbatimChar"/>
+    <w:rPr>
+      <w:color w:val="007020"/>
+      <w:b/>
+    </w:rPr>
+  </w:style>
+  <w:style w:customStyle="1" w:styleId="DataTypeTok" w:type="character">
+    <w:name w:val="DataTypeTok"/>
+    <w:basedOn w:val="VerbatimChar"/>
+    <w:rPr>
+      <w:color w:val="902000"/>
+    </w:rPr>
+  </w:style>
+  <w:style w:customStyle="1" w:styleId="DecValTok" w:type="character">
+    <w:name w:val="DecValTok"/>
+    <w:basedOn w:val="VerbatimChar"/>
+    <w:rPr>
+      <w:color w:val="40a070"/>
+    </w:rPr>
+  </w:style>
+  <w:style w:customStyle="1" w:styleId="BaseNTok" w:type="character">
+    <w:name w:val="BaseNTok"/>
+    <w:basedOn w:val="VerbatimChar"/>
+    <w:rPr>
+      <w:color w:val="40a070"/>
+    </w:rPr>
+  </w:style>
+  <w:style w:customStyle="1" w:styleId="FloatTok" w:type="character">
+    <w:name w:val="FloatTok"/>
+    <w:basedOn w:val="VerbatimChar"/>
+    <w:rPr>
+      <w:color w:val="40a070"/>
+    </w:rPr>
+  </w:style>
+  <w:style w:customStyle="1" w:styleId="ConstantTok" w:type="character">
+    <w:name w:val="ConstantTok"/>
+    <w:basedOn w:val="VerbatimChar"/>
+    <w:rPr>
+      <w:color w:val="880000"/>
+    </w:rPr>
+  </w:style>
+  <w:style w:customStyle="1" w:styleId="CharTok" w:type="character">
+    <w:name w:val="CharTok"/>
+    <w:basedOn w:val="VerbatimChar"/>
+    <w:rPr>
+      <w:color w:val="4070a0"/>
+    </w:rPr>
+  </w:style>
+  <w:style w:customStyle="1" w:styleId="SpecialCharTok" w:type="character">
+    <w:name w:val="SpecialCharTok"/>
+    <w:basedOn w:val="VerbatimChar"/>
+    <w:rPr>
+      <w:color w:val="4070a0"/>
+    </w:rPr>
+  </w:style>
+  <w:style w:customStyle="1" w:styleId="StringTok" w:type="character">
+    <w:name w:val="StringTok"/>
+    <w:basedOn w:val="VerbatimChar"/>
+    <w:rPr>
+      <w:color w:val="4070a0"/>
+    </w:rPr>
+  </w:style>
+  <w:style w:customStyle="1" w:styleId="VerbatimStringTok" w:type="character">
+    <w:name w:val="VerbatimStringTok"/>
+    <w:basedOn w:val="VerbatimChar"/>
+    <w:rPr>
+      <w:color w:val="4070a0"/>
+    </w:rPr>
+  </w:style>
+  <w:style w:customStyle="1" w:styleId="SpecialStringTok" w:type="character">
+    <w:name w:val="SpecialStringTok"/>
+    <w:basedOn w:val="VerbatimChar"/>
+    <w:rPr>
+      <w:color w:val="bb6688"/>
+    </w:rPr>
+  </w:style>
+  <w:style w:customStyle="1" w:styleId="ImportTok" w:type="character">
+    <w:name w:val="ImportTok"/>
+    <w:basedOn w:val="VerbatimChar"/>
+    <w:rPr>
+      <w:color w:val="008000"/>
+      <w:b/>
+    </w:rPr>
+  </w:style>
+  <w:style w:customStyle="1" w:styleId="CommentTok" w:type="character">
+    <w:name w:val="CommentTok"/>
+    <w:basedOn w:val="VerbatimChar"/>
+    <w:rPr>
+      <w:color w:val="60a0b0"/>
+      <w:i/>
+    </w:rPr>
+  </w:style>
+  <w:style w:customStyle="1" w:styleId="DocumentationTok" w:type="character">
+    <w:name w:val="DocumentationTok"/>
+    <w:basedOn w:val="VerbatimChar"/>
+    <w:rPr>
+      <w:color w:val="ba2121"/>
+      <w:i/>
+    </w:rPr>
+  </w:style>
+  <w:style w:customStyle="1" w:styleId="AnnotationTok" w:type="character">
+    <w:name w:val="AnnotationTok"/>
+    <w:basedOn w:val="VerbatimChar"/>
+    <w:rPr>
+      <w:color w:val="60a0b0"/>
+      <w:b/>
+      <w:i/>
+    </w:rPr>
+  </w:style>
+  <w:style w:customStyle="1" w:styleId="CommentVarTok" w:type="character">
+    <w:name w:val="CommentVarTok"/>
+    <w:basedOn w:val="VerbatimChar"/>
+    <w:rPr>
+      <w:color w:val="60a0b0"/>
+      <w:b/>
+      <w:i/>
+    </w:rPr>
+  </w:style>
+  <w:style w:customStyle="1" w:styleId="OtherTok" w:type="character">
+    <w:name w:val="OtherTok"/>
+    <w:basedOn w:val="VerbatimChar"/>
+    <w:rPr>
+      <w:color w:val="007020"/>
+    </w:rPr>
+  </w:style>
+  <w:style w:customStyle="1" w:styleId="FunctionTok" w:type="character">
+    <w:name w:val="FunctionTok"/>
+    <w:basedOn w:val="VerbatimChar"/>
+    <w:rPr>
+      <w:color w:val="06287e"/>
+    </w:rPr>
+  </w:style>
+  <w:style w:customStyle="1" w:styleId="VariableTok" w:type="character">
+    <w:name w:val="VariableTok"/>
+    <w:basedOn w:val="VerbatimChar"/>
+    <w:rPr>
+      <w:color w:val="19177c"/>
+    </w:rPr>
+  </w:style>
+  <w:style w:customStyle="1" w:styleId="ControlFlowTok" w:type="character">
+    <w:name w:val="ControlFlowTok"/>
+    <w:basedOn w:val="VerbatimChar"/>
+    <w:rPr>
+      <w:color w:val="007020"/>
+      <w:b/>
+    </w:rPr>
+  </w:style>
+  <w:style w:customStyle="1" w:styleId="OperatorTok" w:type="character">
+    <w:name w:val="OperatorTok"/>
+    <w:basedOn w:val="VerbatimChar"/>
+    <w:rPr>
+      <w:color w:val="666666"/>
+    </w:rPr>
+  </w:style>
+  <w:style w:customStyle="1" w:styleId="BuiltInTok" w:type="character">
+    <w:name w:val="BuiltInTok"/>
+    <w:basedOn w:val="VerbatimChar"/>
+    <w:rPr>
+      <w:color w:val="008000"/>
+    </w:rPr>
+  </w:style>
+  <w:style w:customStyle="1" w:styleId="ExtensionTok" w:type="character">
+    <w:name w:val="ExtensionTok"/>
+    <w:basedOn w:val="VerbatimChar"/>
+    <w:rPr/>
+  </w:style>
+  <w:style w:customStyle="1" w:styleId="PreprocessorTok" w:type="character">
+    <w:name w:val="PreprocessorTok"/>
+    <w:basedOn w:val="VerbatimChar"/>
+    <w:rPr>
+      <w:color w:val="bc7a00"/>
+    </w:rPr>
+  </w:style>
+  <w:style w:customStyle="1" w:styleId="AttributeTok" w:type="character">
+    <w:name w:val="AttributeTok"/>
+    <w:basedOn w:val="VerbatimChar"/>
+    <w:rPr>
+      <w:color w:val="7d9029"/>
+    </w:rPr>
+  </w:style>
+  <w:style w:customStyle="1" w:styleId="RegionMarkerTok" w:type="character">
+    <w:name w:val="RegionMarkerTok"/>
+    <w:basedOn w:val="VerbatimChar"/>
+    <w:rPr/>
+  </w:style>
+  <w:style w:customStyle="1" w:styleId="InformationTok" w:type="character">
+    <w:name w:val="InformationTok"/>
+    <w:basedOn w:val="VerbatimChar"/>
+    <w:rPr>
+      <w:color w:val="60a0b0"/>
+      <w:b/>
+      <w:i/>
+    </w:rPr>
+  </w:style>
+  <w:style w:customStyle="1" w:styleId="WarningTok" w:type="character">
+    <w:name w:val="WarningTok"/>
+    <w:basedOn w:val="VerbatimChar"/>
+    <w:rPr>
+      <w:color w:val="60a0b0"/>
+      <w:b/>
+      <w:i/>
+    </w:rPr>
+  </w:style>
+  <w:style w:customStyle="1" w:styleId="AlertTok" w:type="character">
+    <w:name w:val="AlertTok"/>
+    <w:basedOn w:val="VerbatimChar"/>
+    <w:rPr>
+      <w:color w:val="ff0000"/>
+      <w:b/>
+    </w:rPr>
+  </w:style>
+  <w:style w:customStyle="1" w:styleId="ErrorTok" w:type="character">
+    <w:name w:val="ErrorTok"/>
+    <w:basedOn w:val="VerbatimChar"/>
+    <w:rPr>
+      <w:color w:val="ff0000"/>
+      <w:b/>
+    </w:rPr>
+  </w:style>
+  <w:style w:customStyle="1" w:styleId="NormalTok" w:type="character">
+    <w:name w:val="NormalTok"/>
+    <w:basedOn w:val="VerbatimChar"/>
+    <w:rPr/>
+  </w:style>
+  <w:style w:customStyle="1" w:styleId="KeywordTok" w:type="character">
+    <w:name w:val="KeywordTok"/>
+    <w:basedOn w:val="VerbatimChar"/>
+    <w:rPr>
+      <w:color w:val="007020"/>
+      <w:b/>
+    </w:rPr>
+  </w:style>
+  <w:style w:customStyle="1" w:styleId="DataTypeTok" w:type="character">
+    <w:name w:val="DataTypeTok"/>
+    <w:basedOn w:val="VerbatimChar"/>
+    <w:rPr>
+      <w:color w:val="902000"/>
+    </w:rPr>
+  </w:style>
+  <w:style w:customStyle="1" w:styleId="DecValTok" w:type="character">
+    <w:name w:val="DecValTok"/>
+    <w:basedOn w:val="VerbatimChar"/>
+    <w:rPr>
+      <w:color w:val="40a070"/>
+    </w:rPr>
+  </w:style>
+  <w:style w:customStyle="1" w:styleId="BaseNTok" w:type="character">
+    <w:name w:val="BaseNTok"/>
+    <w:basedOn w:val="VerbatimChar"/>
+    <w:rPr>
+      <w:color w:val="40a070"/>
+    </w:rPr>
+  </w:style>
+  <w:style w:customStyle="1" w:styleId="FloatTok" w:type="character">
+    <w:name w:val="FloatTok"/>
+    <w:basedOn w:val="VerbatimChar"/>
+    <w:rPr>
+      <w:color w:val="40a070"/>
+    </w:rPr>
+  </w:style>
+  <w:style w:customStyle="1" w:styleId="ConstantTok" w:type="character">
+    <w:name w:val="ConstantTok"/>
+    <w:basedOn w:val="VerbatimChar"/>
+    <w:rPr>
+      <w:color w:val="880000"/>
+    </w:rPr>
+  </w:style>
+  <w:style w:customStyle="1" w:styleId="CharTok" w:type="character">
+    <w:name w:val="CharTok"/>
+    <w:basedOn w:val="VerbatimChar"/>
+    <w:rPr>
+      <w:color w:val="4070a0"/>
+    </w:rPr>
+  </w:style>
+  <w:style w:customStyle="1" w:styleId="SpecialCharTok" w:type="character">
+    <w:name w:val="SpecialCharTok"/>
+    <w:basedOn w:val="VerbatimChar"/>
+    <w:rPr>
+      <w:color w:val="4070a0"/>
+    </w:rPr>
+  </w:style>
+  <w:style w:customStyle="1" w:styleId="StringTok" w:type="character">
+    <w:name w:val="StringTok"/>
+    <w:basedOn w:val="VerbatimChar"/>
+    <w:rPr>
+      <w:color w:val="4070a0"/>
+    </w:rPr>
+  </w:style>
+  <w:style w:customStyle="1" w:styleId="VerbatimStringTok" w:type="character">
+    <w:name w:val="VerbatimStringTok"/>
+    <w:basedOn w:val="VerbatimChar"/>
+    <w:rPr>
+      <w:color w:val="4070a0"/>
+    </w:rPr>
+  </w:style>
+  <w:style w:customStyle="1" w:styleId="SpecialStringTok" w:type="character">
+    <w:name w:val="SpecialStringTok"/>
+    <w:basedOn w:val="VerbatimChar"/>
+    <w:rPr>
+      <w:color w:val="bb6688"/>
+    </w:rPr>
+  </w:style>
+  <w:style w:customStyle="1" w:styleId="ImportTok" w:type="character">
+    <w:name w:val="ImportTok"/>
+    <w:basedOn w:val="VerbatimChar"/>
+    <w:rPr>
+      <w:color w:val="008000"/>
+      <w:b/>
+    </w:rPr>
+  </w:style>
+  <w:style w:customStyle="1" w:styleId="CommentTok" w:type="character">
+    <w:name w:val="CommentTok"/>
+    <w:basedOn w:val="VerbatimChar"/>
+    <w:rPr>
+      <w:color w:val="60a0b0"/>
+      <w:i/>
+    </w:rPr>
+  </w:style>
+  <w:style w:customStyle="1" w:styleId="DocumentationTok" w:type="character">
+    <w:name w:val="DocumentationTok"/>
+    <w:basedOn w:val="VerbatimChar"/>
+    <w:rPr>
+      <w:color w:val="ba2121"/>
+      <w:i/>
+    </w:rPr>
+  </w:style>
+  <w:style w:customStyle="1" w:styleId="AnnotationTok" w:type="character">
+    <w:name w:val="AnnotationTok"/>
+    <w:basedOn w:val="VerbatimChar"/>
+    <w:rPr>
+      <w:color w:val="60a0b0"/>
+      <w:b/>
+      <w:i/>
+    </w:rPr>
+  </w:style>
+  <w:style w:customStyle="1" w:styleId="CommentVarTok" w:type="character">
+    <w:name w:val="CommentVarTok"/>
+    <w:basedOn w:val="VerbatimChar"/>
+    <w:rPr>
+      <w:color w:val="60a0b0"/>
+      <w:b/>
+      <w:i/>
+    </w:rPr>
+  </w:style>
+  <w:style w:customStyle="1" w:styleId="OtherTok" w:type="character">
+    <w:name w:val="OtherTok"/>
+    <w:basedOn w:val="VerbatimChar"/>
+    <w:rPr>
+      <w:color w:val="007020"/>
+    </w:rPr>
+  </w:style>
+  <w:style w:customStyle="1" w:styleId="FunctionTok" w:type="character">
+    <w:name w:val="FunctionTok"/>
+    <w:basedOn w:val="VerbatimChar"/>
+    <w:rPr>
+      <w:color w:val="06287e"/>
+    </w:rPr>
+  </w:style>
+  <w:style w:customStyle="1" w:styleId="VariableTok" w:type="character">
+    <w:name w:val="VariableTok"/>
+    <w:basedOn w:val="VerbatimChar"/>
+    <w:rPr>
+      <w:color w:val="19177c"/>
+    </w:rPr>
+  </w:style>
+  <w:style w:customStyle="1" w:styleId="ControlFlowTok" w:type="character">
+    <w:name w:val="ControlFlowTok"/>
+    <w:basedOn w:val="VerbatimChar"/>
+    <w:rPr>
+      <w:color w:val="007020"/>
+      <w:b/>
+    </w:rPr>
+  </w:style>
+  <w:style w:customStyle="1" w:styleId="OperatorTok" w:type="character">
+    <w:name w:val="OperatorTok"/>
+    <w:basedOn w:val="VerbatimChar"/>
+    <w:rPr>
+      <w:color w:val="666666"/>
+    </w:rPr>
+  </w:style>
+  <w:style w:customStyle="1" w:styleId="BuiltInTok" w:type="character">
+    <w:name w:val="BuiltInTok"/>
+    <w:basedOn w:val="VerbatimChar"/>
+    <w:rPr>
+      <w:color w:val="008000"/>
+    </w:rPr>
+  </w:style>
+  <w:style w:customStyle="1" w:styleId="ExtensionTok" w:type="character">
+    <w:name w:val="ExtensionTok"/>
+    <w:basedOn w:val="VerbatimChar"/>
+    <w:rPr/>
+  </w:style>
+  <w:style w:customStyle="1" w:styleId="PreprocessorTok" w:type="character">
+    <w:name w:val="PreprocessorTok"/>
+    <w:basedOn w:val="VerbatimChar"/>
+    <w:rPr>
+      <w:color w:val="bc7a00"/>
+    </w:rPr>
+  </w:style>
+  <w:style w:customStyle="1" w:styleId="AttributeTok" w:type="character">
+    <w:name w:val="AttributeTok"/>
+    <w:basedOn w:val="VerbatimChar"/>
+    <w:rPr>
+      <w:color w:val="7d9029"/>
+    </w:rPr>
+  </w:style>
+  <w:style w:customStyle="1" w:styleId="RegionMarkerTok" w:type="character">
+    <w:name w:val="RegionMarkerTok"/>
+    <w:basedOn w:val="VerbatimChar"/>
+    <w:rPr/>
+  </w:style>
+  <w:style w:customStyle="1" w:styleId="InformationTok" w:type="character">
+    <w:name w:val="InformationTok"/>
+    <w:basedOn w:val="VerbatimChar"/>
+    <w:rPr>
+      <w:color w:val="60a0b0"/>
+      <w:b/>
+      <w:i/>
+    </w:rPr>
+  </w:style>
+  <w:style w:customStyle="1" w:styleId="WarningTok" w:type="character">
+    <w:name w:val="WarningTok"/>
+    <w:basedOn w:val="VerbatimChar"/>
+    <w:rPr>
+      <w:color w:val="60a0b0"/>
+      <w:b/>
+      <w:i/>
+    </w:rPr>
+  </w:style>
+  <w:style w:customStyle="1" w:styleId="AlertTok" w:type="character">
+    <w:name w:val="AlertTok"/>
+    <w:basedOn w:val="VerbatimChar"/>
+    <w:rPr>
+      <w:color w:val="ff0000"/>
+      <w:b/>
+    </w:rPr>
+  </w:style>
+  <w:style w:customStyle="1" w:styleId="ErrorTok" w:type="character">
+    <w:name w:val="ErrorTok"/>
+    <w:basedOn w:val="VerbatimChar"/>
+    <w:rPr>
+      <w:color w:val="ff0000"/>
+      <w:b/>
+    </w:rPr>
+  </w:style>
+  <w:style w:customStyle="1" w:styleId="NormalTok" w:type="character">
+    <w:name w:val="NormalTok"/>
+    <w:basedOn w:val="VerbatimChar"/>
+    <w:rPr/>
   </w:style>
   <w:style w:customStyle="1" w:styleId="KeywordTok" w:type="character">
     <w:name w:val="KeywordTok"/>

</xml_diff>